<commit_message>
Reformat Relevo validation packet for class review
</commit_message>
<xml_diff>
--- a/07_validacion/entrega-23-09-2026/relevo-paquete-testeo-23-09-2026.docx
+++ b/07_validacion/entrega-23-09-2026/relevo-paquete-testeo-23-09-2026.docx
@@ -5,100 +5,258 @@
     <w:p>
       <w:pPr>
         <w:pStyle w:val="Title"/>
+        <w:keepLines w:val="0"/>
       </w:pPr>
       <w:r>
-        <w:t>Relevo paquete de validación</w:t>
+        <w:t>Guía para aplicar la prueba</w:t>
+      </w:r>
+    </w:p>
+    <w:p>
+      <w:pPr>
+        <w:keepLines w:val="0"/>
+        <w:spacing w:after="200"/>
+      </w:pPr>
+      <w:r>
+        <w:t>Relevo  ·  Proyecto de Título en Diseño  ·  Johan Yantén  ·  23 de septiembre de 2026</w:t>
+      </w:r>
+    </w:p>
+    <w:p>
+      <w:pPr>
+        <w:keepLines w:val="0"/>
+      </w:pPr>
+      <w:r>
+        <w:t>Esta guía acompaña la corrección docente. El consentimiento y las dos copias de la hoja para participantes comienzan en páginas separadas.</w:t>
+      </w:r>
+    </w:p>
+    <w:p>
+      <w:pPr>
+        <w:pStyle w:val="Heading1"/>
+        <w:keepLines w:val="0"/>
+      </w:pPr>
+      <w:r>
+        <w:t>Estado para la corrección</w:t>
+      </w:r>
+    </w:p>
+    <w:p>
+      <w:pPr>
+        <w:spacing w:after="60"/>
+        <w:ind w:left="255" w:hanging="215"/>
+      </w:pPr>
+      <w:r>
+        <w:t xml:space="preserve">•  </w:t>
+      </w:r>
+      <w:r>
+        <w:rPr>
+          <w:b/>
+        </w:rPr>
+        <w:t xml:space="preserve">Prototipo: </w:t>
+      </w:r>
+      <w:r>
+        <w:t>APK Android 2.2 compilado y revisado en emulador. El funcionamiento con un teléfono y un parlante Bluetooth concretos aún necesita comprobación física.</w:t>
+      </w:r>
+    </w:p>
+    <w:p>
+      <w:pPr>
+        <w:spacing w:after="60"/>
+        <w:ind w:left="255" w:hanging="215"/>
+      </w:pPr>
+      <w:r>
+        <w:t xml:space="preserve">•  </w:t>
+      </w:r>
+      <w:r>
+        <w:rPr>
+          <w:b/>
+        </w:rPr>
+        <w:t xml:space="preserve">Instrumentos: </w:t>
+      </w:r>
+      <w:r>
+        <w:t>pauta, indicadores, consentimiento y hoja de dos días preparados para revisión docente.</w:t>
+      </w:r>
+    </w:p>
+    <w:p>
+      <w:pPr>
+        <w:spacing w:after="60"/>
+        <w:ind w:left="255" w:hanging="215"/>
+      </w:pPr>
+      <w:r>
+        <w:t xml:space="preserve">•  </w:t>
+      </w:r>
+      <w:r>
+        <w:rPr>
+          <w:b/>
+        </w:rPr>
+        <w:t xml:space="preserve">Plan individual: </w:t>
+      </w:r>
+      <w:r>
+        <w:t>completado en la pestaña «Johan» del calendario del curso.</w:t>
+      </w:r>
+    </w:p>
+    <w:p>
+      <w:pPr>
+        <w:spacing w:after="60"/>
+        <w:ind w:left="255" w:hanging="215"/>
+      </w:pPr>
+      <w:r>
+        <w:t xml:space="preserve">•  </w:t>
+      </w:r>
+      <w:r>
+        <w:rPr>
+          <w:b/>
+        </w:rPr>
+        <w:t xml:space="preserve">Resultados de participantes: </w:t>
+      </w:r>
+      <w:r>
+        <w:t>todavía no existen.</w:t>
       </w:r>
     </w:p>
     <w:p>
       <w:r>
-        <w:t>Proyecto de Título en Diseño · Universidad Diego Portales · Johan Yantén · 23 de septiembre de 2026</w:t>
+        <w:t>La pregunta principal es si una persona puede preparar Relevo, entender qué uso de una aplicación activa el aviso, reconocer el sonido del parlante situado cerca de la actividad y cerrar el ciclo sin ayuda. También interesa saber cuándo el aviso molesta o no resulta pertinente. La prueba observa comprensión y uso del prototipo; no demuestra por sí sola que la persona realizó la actividad que había elegido.</w:t>
+      </w:r>
+    </w:p>
+    <w:p>
+      <w:pPr>
+        <w:pStyle w:val="Heading1"/>
+        <w:keepLines w:val="0"/>
+      </w:pPr>
+      <w:r>
+        <w:t>Antes de entregar el kit</w:t>
+      </w:r>
+    </w:p>
+    <w:p>
+      <w:pPr>
+        <w:spacing w:after="80"/>
+        <w:ind w:left="312" w:hanging="283"/>
+      </w:pPr>
+      <w:r>
+        <w:rPr>
+          <w:b/>
+        </w:rPr>
+        <w:t xml:space="preserve">1. </w:t>
+      </w:r>
+      <w:r>
+        <w:t>Comprobar en el teléfono y parlante que se usarán: permisos, conexión, sonido solo por el parlante, aviso con Relevo fuera de pantalla, pausa del conteo al salir de la aplicación elegida, desconexión y silenciamiento. Registrar modelos y versión del APK.</w:t>
+      </w:r>
+    </w:p>
+    <w:p>
+      <w:pPr>
+        <w:spacing w:after="80"/>
+        <w:ind w:left="312" w:hanging="283"/>
+      </w:pPr>
+      <w:r>
+        <w:rPr>
+          <w:b/>
+        </w:rPr>
+        <w:t xml:space="preserve">2. </w:t>
+      </w:r>
+      <w:r>
+        <w:t>Completar y revisar el consentimiento. La persona debe poder identificar sus registros y solicitar su eliminación. Si esto todavía no funciona, no recoger datos de participantes.</w:t>
+      </w:r>
+    </w:p>
+    <w:p>
+      <w:pPr>
+        <w:spacing w:after="80"/>
+        <w:ind w:left="312" w:hanging="283"/>
+      </w:pPr>
+      <w:r>
+        <w:rPr>
+          <w:b/>
+        </w:rPr>
+        <w:t xml:space="preserve">3. </w:t>
+      </w:r>
+      <w:r>
+        <w:t>Preparar un parlante Bluetooth, el APK y dos copias idénticas de la hoja de registro. La segunda es de repuesto. El consentimiento se firma por separado.</w:t>
+      </w:r>
+    </w:p>
+    <w:p>
+      <w:pPr>
+        <w:spacing w:after="80"/>
+      </w:pPr>
+      <w:r>
+        <w:t>Si falla alguna función crítica, detener la prueba de la señal, corregir el prototipo y repetir el ensayo técnico. No atribuir el fallo a la persona.</w:t>
+      </w:r>
+    </w:p>
+    <w:p>
+      <w:pPr>
+        <w:pStyle w:val="Heading1"/>
+        <w:keepLines w:val="0"/>
+      </w:pPr>
+      <w:r>
+        <w:t>Sesión inicial</w:t>
+      </w:r>
+    </w:p>
+    <w:p>
+      <w:pPr>
+        <w:spacing w:after="80"/>
+        <w:ind w:left="312" w:hanging="283"/>
+      </w:pPr>
+      <w:r>
+        <w:rPr>
+          <w:b/>
+        </w:rPr>
+        <w:t xml:space="preserve">1. </w:t>
+      </w:r>
+      <w:r>
+        <w:t>Explicar la participación y resolver dudas antes de pedir consentimiento o permisos del teléfono.</w:t>
+      </w:r>
+    </w:p>
+    <w:p>
+      <w:pPr>
+        <w:spacing w:after="80"/>
+        <w:ind w:left="312" w:hanging="283"/>
+      </w:pPr>
+      <w:r>
+        <w:rPr>
+          <w:b/>
+        </w:rPr>
+        <w:t xml:space="preserve">2. </w:t>
+      </w:r>
+      <w:r>
+        <w:t>Pedir una tarea sin explicar los botones: «Piensa en una actividad que quieras empezar cuando sueles seguir usando otra aplicación. Prepara Relevo para que te avise cuando se cumpla el tiempo que elijas».</w:t>
+      </w:r>
+    </w:p>
+    <w:p>
+      <w:pPr>
+        <w:spacing w:after="80"/>
+        <w:ind w:left="312" w:hanging="283"/>
+      </w:pPr>
+      <w:r>
+        <w:rPr>
+          <w:b/>
+        </w:rPr>
+        <w:t xml:space="preserve">3. </w:t>
+      </w:r>
+      <w:r>
+        <w:t>Observar dónde duda, si necesita ayuda y dónde decide dejar el parlante. Preguntar antes del aviso: «¿Qué esperas que ocurra?».</w:t>
+      </w:r>
+    </w:p>
+    <w:p>
+      <w:pPr>
+        <w:spacing w:after="80"/>
+        <w:ind w:left="312" w:hanging="283"/>
+      </w:pPr>
+      <w:r>
+        <w:rPr>
+          <w:b/>
+        </w:rPr>
+        <w:t xml:space="preserve">4. </w:t>
+      </w:r>
+      <w:r>
+        <w:t>Después del aviso, preguntar: «¿Qué te recordó?» y «¿Cómo pensabas empezar?». Pedir que cierre el relevo como prefiera. Anotar toda ayuda proporcionada.</w:t>
+      </w:r>
+    </w:p>
+    <w:p>
+      <w:pPr>
+        <w:pStyle w:val="Heading1"/>
+        <w:keepLines w:val="0"/>
+      </w:pPr>
+      <w:r>
+        <w:t>Uso de dos días y cierre</w:t>
       </w:r>
     </w:p>
     <w:p>
       <w:r>
-        <w:t>Este documento reúne la pauta del investigador, el consentimiento y la hoja que se entrega a cada participante. La prueba prevista dura dos días. Cada persona recibe un parlante Bluetooth pequeño, el archivo APK de Relevo para Android y dos copias idénticas de la hoja de evaluación; la segunda queda de repuesto. El consentimiento se entrega por separado.</w:t>
-      </w:r>
-    </w:p>
-    <w:p>
-      <w:pPr>
-        <w:pStyle w:val="Heading1"/>
-      </w:pPr>
-      <w:r>
-        <w:t>Entregables y estado</w:t>
-      </w:r>
-    </w:p>
-    <w:p>
-      <w:pPr>
-        <w:pStyle w:val="ListBullet"/>
-        <w:spacing w:after="60"/>
-        <w:ind w:left="317" w:hanging="173"/>
-      </w:pPr>
-      <w:r>
-        <w:t>Prototipo: APK Android 2.2 construido. Se revisó en emulador; el conjunto teléfono y parlante requiere ensayo físico antes de convocar.</w:t>
-      </w:r>
-    </w:p>
-    <w:p>
-      <w:pPr>
-        <w:pStyle w:val="ListBullet"/>
-        <w:spacing w:after="60"/>
-        <w:ind w:left="317" w:hanging="173"/>
-      </w:pPr>
-      <w:r>
-        <w:t>Indicadores: definidos en esta pauta y sujetos a corrección docente.</w:t>
-      </w:r>
-    </w:p>
-    <w:p>
-      <w:pPr>
-        <w:pStyle w:val="ListBullet"/>
-        <w:spacing w:after="60"/>
-        <w:ind w:left="317" w:hanging="173"/>
-      </w:pPr>
-      <w:r>
-        <w:t>Plan individual: registrar fechas, responsable y resultados esperados en el documento de planificación del curso. La hoja de ruta del repositorio no reemplaza ese formulario.</w:t>
-      </w:r>
-    </w:p>
-    <w:p>
-      <w:pPr>
-        <w:pStyle w:val="ListBullet"/>
-        <w:spacing w:after="60"/>
-        <w:ind w:left="317" w:hanging="173"/>
-      </w:pPr>
-      <w:r>
-        <w:t>Resultados con personas: aún no existen.</w:t>
-      </w:r>
-    </w:p>
-    <w:p>
-      <w:pPr>
-        <w:pStyle w:val="Heading1"/>
-      </w:pPr>
-      <w:r>
-        <w:t>Pauta del investigador</w:t>
-      </w:r>
-    </w:p>
-    <w:p>
-      <w:r>
-        <w:t>La pregunta es si una persona puede preparar un relevo, comprender qué uso activa el aviso, reconocer la señal situada y cerrar el ciclo sin ayuda. También interesa cuándo el aviso sobra. La observación del uso no demuestra que la persona haya hecho la actividad elegida.</w:t>
-      </w:r>
-    </w:p>
-    <w:p>
-      <w:r>
-        <w:t>Las tareas parten de una meta cotidiana, se observan sin dirigir a la persona y se interpretan junto con su contexto, conforme al diseño centrado en las personas (Organización Internacional de Normalización [ISO], 2019) y a la práctica de testeo de usabilidad con tareas reales (Nielsen Norman Group, 2019).</w:t>
-      </w:r>
-    </w:p>
-    <w:p>
-      <w:r>
-        <w:t>Antes de entregar el kit, comprobar en el teléfono y parlante concretos: conexión, reproducción únicamente por el parlante, aviso con Relevo fuera de pantalla, pausa del conteo cuando la app elegida deja de estar en primer plano, desconexión y silenciamiento. Registrar modelos y versión del APK. Si falla, suspender la prueba de la señal; no atribuir el fallo a la persona.</w:t>
-      </w:r>
-    </w:p>
-    <w:p>
-      <w:r>
-        <w:t>Presentar la prueba sin explicar los botones. Pedir: «Piensa en una actividad que te gustaría empezar en un momento en que sueles seguir usando otra app. Deja preparado Relevo para que te avise cuando se cumpla el tiempo que elijas». Observar acciones y dudas. Después: «Deja el parlante donde tenga sentido para empezar». Antes del aviso preguntar: «¿Qué esperas que ocurra?». Cuando llegue, no interrumpir; después preguntar: «¿Qué te recordó?» y «¿Cómo pensabas empezar?». Al cerrar: «Termina el relevo como prefieras». Registrar toda ayuda que se dé.</w:t>
-      </w:r>
-    </w:p>
-    <w:p>
-      <w:r>
-        <w:t>En el uso de dos días, la persona decide cuándo activar Relevo y puede no usarlo; un día sin activación también se registra. Al finalizar, recuperar el parlante y las hojas. No leer mensajes, búsquedas ni contenido de las aplicaciones elegidas. No solicitar capturas ni grabaciones sin consentimiento adicional.</w:t>
+        <w:t>La persona decide cuándo activar Relevo y puede no usarlo. Un día sin activación también se registra. Al terminar, conversar brevemente sobre la hoja, recuperar el parlante y la hoja utilizada, y registrar fallos técnicos por separado de dificultades de comprensión. No revisar mensajes, búsquedas ni contenido de otras aplicaciones. No solicitar capturas ni grabaciones sin consentimiento adicional.</w:t>
       </w:r>
     </w:p>
     <w:p>
@@ -109,35 +267,48 @@
     <w:p>
       <w:pPr>
         <w:pStyle w:val="Title"/>
+        <w:keepLines w:val="0"/>
       </w:pPr>
       <w:r>
-        <w:t>Indicadores para revisar en clase</w:t>
+        <w:t>Indicadores y pendientes</w:t>
       </w:r>
     </w:p>
     <w:p>
       <w:pPr>
-        <w:pStyle w:val="Heading2"/>
+        <w:keepLines w:val="0"/>
+        <w:spacing w:after="160"/>
       </w:pPr>
       <w:r>
-        <w:t>Indicadores y decisión</w:t>
+        <w:t>Uso del investigador  ·  revisión con el docente antes de convocar participantes</w:t>
+      </w:r>
+    </w:p>
+    <w:p>
+      <w:pPr>
+        <w:pStyle w:val="Heading1"/>
+        <w:keepLines w:val="0"/>
+      </w:pPr>
+      <w:r>
+        <w:t>Indicadores de la prueba</w:t>
       </w:r>
     </w:p>
     <w:tbl>
       <w:tblPr>
-        <w:tblStyle w:val="TableGrid"/>
         <w:tblW w:type="auto" w:w="0"/>
         <w:tblLayout w:type="fixed"/>
         <w:tblLook w:firstColumn="1" w:firstRow="1" w:lastColumn="0" w:lastRow="0" w:noHBand="0" w:noVBand="1" w:val="04A0"/>
       </w:tblPr>
       <w:tblGrid>
-        <w:gridCol w:w="3351"/>
-        <w:gridCol w:w="3351"/>
-        <w:gridCol w:w="3351"/>
+        <w:gridCol w:w="3213"/>
+        <w:gridCol w:w="3213"/>
+        <w:gridCol w:w="3213"/>
       </w:tblGrid>
       <w:tr>
+        <w:trPr>
+          <w:tblHeader w:val="true"/>
+        </w:trPr>
         <w:tc>
           <w:tcPr>
-            <w:tcW w:type="dxa" w:w="2045"/>
+            <w:tcW w:type="dxa" w:w="2041"/>
             <w:vAlign w:val="center"/>
             <w:tcBorders>
               <w:top w:val="single" w:sz="4" w:color="D9D9D9"/>
@@ -147,11 +318,17 @@
               <w:insideH w:val="single" w:sz="4" w:color="D9D9D9"/>
               <w:insideV w:val="single" w:sz="4" w:color="D9D9D9"/>
             </w:tcBorders>
-            <w:shd w:fill="E8ECEA"/>
+            <w:tcMar>
+              <w:top w:w="75" w:type="dxa"/>
+              <w:bottom w:w="75" w:type="dxa"/>
+              <w:left w:w="90" w:type="dxa"/>
+              <w:right w:w="90" w:type="dxa"/>
+            </w:tcMar>
+            <w:shd w:fill="E9ECEB"/>
           </w:tcPr>
           <w:p>
             <w:pPr>
-              <w:spacing w:after="20" w:before="20"/>
+              <w:spacing w:after="0" w:line="262" w:lineRule="auto"/>
             </w:pPr>
             <w:r>
               <w:rPr>
@@ -165,7 +342,7 @@
         </w:tc>
         <w:tc>
           <w:tcPr>
-            <w:tcW w:type="dxa" w:w="3240"/>
+            <w:tcW w:type="dxa" w:w="3628"/>
             <w:vAlign w:val="center"/>
             <w:tcBorders>
               <w:top w:val="single" w:sz="4" w:color="D9D9D9"/>
@@ -175,11 +352,17 @@
               <w:insideH w:val="single" w:sz="4" w:color="D9D9D9"/>
               <w:insideV w:val="single" w:sz="4" w:color="D9D9D9"/>
             </w:tcBorders>
-            <w:shd w:fill="E8ECEA"/>
+            <w:tcMar>
+              <w:top w:w="75" w:type="dxa"/>
+              <w:bottom w:w="75" w:type="dxa"/>
+              <w:left w:w="90" w:type="dxa"/>
+              <w:right w:w="90" w:type="dxa"/>
+            </w:tcMar>
+            <w:shd w:fill="E9ECEB"/>
           </w:tcPr>
           <w:p>
             <w:pPr>
-              <w:spacing w:after="20" w:before="20"/>
+              <w:spacing w:after="0" w:line="262" w:lineRule="auto"/>
             </w:pPr>
             <w:r>
               <w:rPr>
@@ -187,13 +370,13 @@
                 <w:b/>
                 <w:sz w:val="16"/>
               </w:rPr>
-              <w:t>Registro</w:t>
+              <w:t>Cómo se registra</w:t>
             </w:r>
           </w:p>
         </w:tc>
         <w:tc>
           <w:tcPr>
-            <w:tcW w:type="dxa" w:w="4752"/>
+            <w:tcW w:type="dxa" w:w="3969"/>
             <w:vAlign w:val="center"/>
             <w:tcBorders>
               <w:top w:val="single" w:sz="4" w:color="D9D9D9"/>
@@ -203,11 +386,17 @@
               <w:insideH w:val="single" w:sz="4" w:color="D9D9D9"/>
               <w:insideV w:val="single" w:sz="4" w:color="D9D9D9"/>
             </w:tcBorders>
-            <w:shd w:fill="E8ECEA"/>
+            <w:tcMar>
+              <w:top w:w="75" w:type="dxa"/>
+              <w:bottom w:w="75" w:type="dxa"/>
+              <w:left w:w="90" w:type="dxa"/>
+              <w:right w:w="90" w:type="dxa"/>
+            </w:tcMar>
+            <w:shd w:fill="E9ECEB"/>
           </w:tcPr>
           <w:p>
             <w:pPr>
-              <w:spacing w:after="20" w:before="20"/>
+              <w:spacing w:after="0" w:line="262" w:lineRule="auto"/>
             </w:pPr>
             <w:r>
               <w:rPr>
@@ -215,7 +404,7 @@
                 <w:b/>
                 <w:sz w:val="16"/>
               </w:rPr>
-              <w:t>Qué permite revisar</w:t>
+              <w:t>Qué ayuda a decidir</w:t>
             </w:r>
           </w:p>
         </w:tc>
@@ -223,7 +412,7 @@
       <w:tr>
         <w:tc>
           <w:tcPr>
-            <w:tcW w:type="dxa" w:w="2045"/>
+            <w:tcW w:type="dxa" w:w="2041"/>
             <w:vAlign w:val="center"/>
             <w:tcBorders>
               <w:top w:val="single" w:sz="4" w:color="D9D9D9"/>
@@ -233,10 +422,16 @@
               <w:insideH w:val="single" w:sz="4" w:color="D9D9D9"/>
               <w:insideV w:val="single" w:sz="4" w:color="D9D9D9"/>
             </w:tcBorders>
+            <w:tcMar>
+              <w:top w:w="75" w:type="dxa"/>
+              <w:bottom w:w="75" w:type="dxa"/>
+              <w:left w:w="90" w:type="dxa"/>
+              <w:right w:w="90" w:type="dxa"/>
+            </w:tcMar>
           </w:tcPr>
           <w:p>
             <w:pPr>
-              <w:spacing w:after="20" w:before="20"/>
+              <w:spacing w:after="0" w:line="262" w:lineRule="auto"/>
             </w:pPr>
             <w:r>
               <w:rPr>
@@ -250,7 +445,7 @@
         </w:tc>
         <w:tc>
           <w:tcPr>
-            <w:tcW w:type="dxa" w:w="3240"/>
+            <w:tcW w:type="dxa" w:w="3628"/>
             <w:vAlign w:val="center"/>
             <w:tcBorders>
               <w:top w:val="single" w:sz="4" w:color="D9D9D9"/>
@@ -260,10 +455,16 @@
               <w:insideH w:val="single" w:sz="4" w:color="D9D9D9"/>
               <w:insideV w:val="single" w:sz="4" w:color="D9D9D9"/>
             </w:tcBorders>
+            <w:tcMar>
+              <w:top w:w="75" w:type="dxa"/>
+              <w:bottom w:w="75" w:type="dxa"/>
+              <w:left w:w="90" w:type="dxa"/>
+              <w:right w:w="90" w:type="dxa"/>
+            </w:tcMar>
           </w:tcPr>
           <w:p>
             <w:pPr>
-              <w:spacing w:after="20" w:before="20"/>
+              <w:spacing w:after="0" w:line="262" w:lineRule="auto"/>
             </w:pPr>
             <w:r>
               <w:rPr>
@@ -271,13 +472,13 @@
                 <w:b w:val="0"/>
                 <w:sz w:val="16"/>
               </w:rPr>
-              <w:t>Sin ayuda, con ayuda o no completada; dónde se detuvo</w:t>
+              <w:t>Sin ayuda, con ayuda o no completada; paso donde se detuvo</w:t>
             </w:r>
           </w:p>
         </w:tc>
         <w:tc>
           <w:tcPr>
-            <w:tcW w:type="dxa" w:w="4752"/>
+            <w:tcW w:type="dxa" w:w="3969"/>
             <w:vAlign w:val="center"/>
             <w:tcBorders>
               <w:top w:val="single" w:sz="4" w:color="D9D9D9"/>
@@ -287,10 +488,16 @@
               <w:insideH w:val="single" w:sz="4" w:color="D9D9D9"/>
               <w:insideV w:val="single" w:sz="4" w:color="D9D9D9"/>
             </w:tcBorders>
+            <w:tcMar>
+              <w:top w:w="75" w:type="dxa"/>
+              <w:bottom w:w="75" w:type="dxa"/>
+              <w:left w:w="90" w:type="dxa"/>
+              <w:right w:w="90" w:type="dxa"/>
+            </w:tcMar>
           </w:tcPr>
           <w:p>
             <w:pPr>
-              <w:spacing w:after="20" w:before="20"/>
+              <w:spacing w:after="0" w:line="262" w:lineRule="auto"/>
             </w:pPr>
             <w:r>
               <w:rPr>
@@ -298,7 +505,7 @@
                 <w:b w:val="0"/>
                 <w:sz w:val="16"/>
               </w:rPr>
-              <w:t>Claridad de actividad, aplicación, umbral y permisos</w:t>
+              <w:t>Qué parte de la configuración necesita cambios</w:t>
             </w:r>
           </w:p>
         </w:tc>
@@ -306,7 +513,7 @@
       <w:tr>
         <w:tc>
           <w:tcPr>
-            <w:tcW w:type="dxa" w:w="2045"/>
+            <w:tcW w:type="dxa" w:w="2041"/>
             <w:vAlign w:val="center"/>
             <w:tcBorders>
               <w:top w:val="single" w:sz="4" w:color="D9D9D9"/>
@@ -316,11 +523,17 @@
               <w:insideH w:val="single" w:sz="4" w:color="D9D9D9"/>
               <w:insideV w:val="single" w:sz="4" w:color="D9D9D9"/>
             </w:tcBorders>
-            <w:shd w:fill="F8F9F8"/>
+            <w:tcMar>
+              <w:top w:w="75" w:type="dxa"/>
+              <w:bottom w:w="75" w:type="dxa"/>
+              <w:left w:w="90" w:type="dxa"/>
+              <w:right w:w="90" w:type="dxa"/>
+            </w:tcMar>
+            <w:shd w:fill="F8F9F9"/>
           </w:tcPr>
           <w:p>
             <w:pPr>
-              <w:spacing w:after="20" w:before="20"/>
+              <w:spacing w:after="0" w:line="262" w:lineRule="auto"/>
             </w:pPr>
             <w:r>
               <w:rPr>
@@ -328,13 +541,13 @@
                 <w:b w:val="0"/>
                 <w:sz w:val="16"/>
               </w:rPr>
-              <w:t>Comprensión previa</w:t>
+              <w:t>Comprensión del conteo</w:t>
             </w:r>
           </w:p>
         </w:tc>
         <w:tc>
           <w:tcPr>
-            <w:tcW w:type="dxa" w:w="3240"/>
+            <w:tcW w:type="dxa" w:w="3628"/>
             <w:vAlign w:val="center"/>
             <w:tcBorders>
               <w:top w:val="single" w:sz="4" w:color="D9D9D9"/>
@@ -344,11 +557,17 @@
               <w:insideH w:val="single" w:sz="4" w:color="D9D9D9"/>
               <w:insideV w:val="single" w:sz="4" w:color="D9D9D9"/>
             </w:tcBorders>
-            <w:shd w:fill="F8F9F8"/>
+            <w:tcMar>
+              <w:top w:w="75" w:type="dxa"/>
+              <w:bottom w:w="75" w:type="dxa"/>
+              <w:left w:w="90" w:type="dxa"/>
+              <w:right w:w="90" w:type="dxa"/>
+            </w:tcMar>
+            <w:shd w:fill="F8F9F9"/>
           </w:tcPr>
           <w:p>
             <w:pPr>
-              <w:spacing w:after="20" w:before="20"/>
+              <w:spacing w:after="0" w:line="262" w:lineRule="auto"/>
             </w:pPr>
             <w:r>
               <w:rPr>
@@ -356,13 +575,13 @@
                 <w:b w:val="0"/>
                 <w:sz w:val="16"/>
               </w:rPr>
-              <w:t>Explica qué aplicación suma tiempo y qué ocurre si sale de ella</w:t>
+              <w:t>Explica qué aplicación suma tiempo y qué ocurre al salir de ella</w:t>
             </w:r>
           </w:p>
         </w:tc>
         <w:tc>
           <w:tcPr>
-            <w:tcW w:type="dxa" w:w="4752"/>
+            <w:tcW w:type="dxa" w:w="3969"/>
             <w:vAlign w:val="center"/>
             <w:tcBorders>
               <w:top w:val="single" w:sz="4" w:color="D9D9D9"/>
@@ -372,11 +591,17 @@
               <w:insideH w:val="single" w:sz="4" w:color="D9D9D9"/>
               <w:insideV w:val="single" w:sz="4" w:color="D9D9D9"/>
             </w:tcBorders>
-            <w:shd w:fill="F8F9F8"/>
+            <w:tcMar>
+              <w:top w:w="75" w:type="dxa"/>
+              <w:bottom w:w="75" w:type="dxa"/>
+              <w:left w:w="90" w:type="dxa"/>
+              <w:right w:w="90" w:type="dxa"/>
+            </w:tcMar>
+            <w:shd w:fill="F8F9F9"/>
           </w:tcPr>
           <w:p>
             <w:pPr>
-              <w:spacing w:after="20" w:before="20"/>
+              <w:spacing w:after="0" w:line="262" w:lineRule="auto"/>
             </w:pPr>
             <w:r>
               <w:rPr>
@@ -384,7 +609,7 @@
                 <w:b w:val="0"/>
                 <w:sz w:val="16"/>
               </w:rPr>
-              <w:t>Lenguaje y respuesta del conteo</w:t>
+              <w:t>Si el lenguaje y el estado de la app son claros</w:t>
             </w:r>
           </w:p>
         </w:tc>
@@ -392,7 +617,7 @@
       <w:tr>
         <w:tc>
           <w:tcPr>
-            <w:tcW w:type="dxa" w:w="2045"/>
+            <w:tcW w:type="dxa" w:w="2041"/>
             <w:vAlign w:val="center"/>
             <w:tcBorders>
               <w:top w:val="single" w:sz="4" w:color="D9D9D9"/>
@@ -402,10 +627,16 @@
               <w:insideH w:val="single" w:sz="4" w:color="D9D9D9"/>
               <w:insideV w:val="single" w:sz="4" w:color="D9D9D9"/>
             </w:tcBorders>
+            <w:tcMar>
+              <w:top w:w="75" w:type="dxa"/>
+              <w:bottom w:w="75" w:type="dxa"/>
+              <w:left w:w="90" w:type="dxa"/>
+              <w:right w:w="90" w:type="dxa"/>
+            </w:tcMar>
           </w:tcPr>
           <w:p>
             <w:pPr>
-              <w:spacing w:after="20" w:before="20"/>
+              <w:spacing w:after="0" w:line="262" w:lineRule="auto"/>
             </w:pPr>
             <w:r>
               <w:rPr>
@@ -413,13 +644,13 @@
                 <w:b w:val="0"/>
                 <w:sz w:val="16"/>
               </w:rPr>
-              <w:t>Lugar elegido</w:t>
+              <w:t>Lugar del parlante</w:t>
             </w:r>
           </w:p>
         </w:tc>
         <w:tc>
           <w:tcPr>
-            <w:tcW w:type="dxa" w:w="3240"/>
+            <w:tcW w:type="dxa" w:w="3628"/>
             <w:vAlign w:val="center"/>
             <w:tcBorders>
               <w:top w:val="single" w:sz="4" w:color="D9D9D9"/>
@@ -429,10 +660,16 @@
               <w:insideH w:val="single" w:sz="4" w:color="D9D9D9"/>
               <w:insideV w:val="single" w:sz="4" w:color="D9D9D9"/>
             </w:tcBorders>
+            <w:tcMar>
+              <w:top w:w="75" w:type="dxa"/>
+              <w:bottom w:w="75" w:type="dxa"/>
+              <w:left w:w="90" w:type="dxa"/>
+              <w:right w:w="90" w:type="dxa"/>
+            </w:tcMar>
           </w:tcPr>
           <w:p>
             <w:pPr>
-              <w:spacing w:after="20" w:before="20"/>
+              <w:spacing w:after="0" w:line="262" w:lineRule="auto"/>
             </w:pPr>
             <w:r>
               <w:rPr>
@@ -440,13 +677,13 @@
                 <w:b w:val="0"/>
                 <w:sz w:val="16"/>
               </w:rPr>
-              <w:t>Ubicación y relación con el inicio de la actividad, según la persona</w:t>
+              <w:t>Lugar elegido y relación con la actividad, según la persona</w:t>
             </w:r>
           </w:p>
         </w:tc>
         <w:tc>
           <w:tcPr>
-            <w:tcW w:type="dxa" w:w="4752"/>
+            <w:tcW w:type="dxa" w:w="3969"/>
             <w:vAlign w:val="center"/>
             <w:tcBorders>
               <w:top w:val="single" w:sz="4" w:color="D9D9D9"/>
@@ -456,10 +693,16 @@
               <w:insideH w:val="single" w:sz="4" w:color="D9D9D9"/>
               <w:insideV w:val="single" w:sz="4" w:color="D9D9D9"/>
             </w:tcBorders>
+            <w:tcMar>
+              <w:top w:w="75" w:type="dxa"/>
+              <w:bottom w:w="75" w:type="dxa"/>
+              <w:left w:w="90" w:type="dxa"/>
+              <w:right w:w="90" w:type="dxa"/>
+            </w:tcMar>
           </w:tcPr>
           <w:p>
             <w:pPr>
-              <w:spacing w:after="20" w:before="20"/>
+              <w:spacing w:after="0" w:line="262" w:lineRule="auto"/>
             </w:pPr>
             <w:r>
               <w:rPr>
@@ -467,7 +710,7 @@
                 <w:b w:val="0"/>
                 <w:sz w:val="16"/>
               </w:rPr>
-              <w:t>Pertinencia de situar la señal</w:t>
+              <w:t>Si situar la señal tiene sentido en ese contexto</w:t>
             </w:r>
           </w:p>
         </w:tc>
@@ -475,7 +718,7 @@
       <w:tr>
         <w:tc>
           <w:tcPr>
-            <w:tcW w:type="dxa" w:w="2045"/>
+            <w:tcW w:type="dxa" w:w="2041"/>
             <w:vAlign w:val="center"/>
             <w:tcBorders>
               <w:top w:val="single" w:sz="4" w:color="D9D9D9"/>
@@ -485,11 +728,17 @@
               <w:insideH w:val="single" w:sz="4" w:color="D9D9D9"/>
               <w:insideV w:val="single" w:sz="4" w:color="D9D9D9"/>
             </w:tcBorders>
-            <w:shd w:fill="F8F9F8"/>
+            <w:tcMar>
+              <w:top w:w="75" w:type="dxa"/>
+              <w:bottom w:w="75" w:type="dxa"/>
+              <w:left w:w="90" w:type="dxa"/>
+              <w:right w:w="90" w:type="dxa"/>
+            </w:tcMar>
+            <w:shd w:fill="F8F9F9"/>
           </w:tcPr>
           <w:p>
             <w:pPr>
-              <w:spacing w:after="20" w:before="20"/>
+              <w:spacing w:after="0" w:line="262" w:lineRule="auto"/>
             </w:pPr>
             <w:r>
               <w:rPr>
@@ -503,7 +752,7 @@
         </w:tc>
         <w:tc>
           <w:tcPr>
-            <w:tcW w:type="dxa" w:w="3240"/>
+            <w:tcW w:type="dxa" w:w="3628"/>
             <w:vAlign w:val="center"/>
             <w:tcBorders>
               <w:top w:val="single" w:sz="4" w:color="D9D9D9"/>
@@ -513,11 +762,17 @@
               <w:insideH w:val="single" w:sz="4" w:color="D9D9D9"/>
               <w:insideV w:val="single" w:sz="4" w:color="D9D9D9"/>
             </w:tcBorders>
-            <w:shd w:fill="F8F9F8"/>
+            <w:tcMar>
+              <w:top w:w="75" w:type="dxa"/>
+              <w:bottom w:w="75" w:type="dxa"/>
+              <w:left w:w="90" w:type="dxa"/>
+              <w:right w:w="90" w:type="dxa"/>
+            </w:tcMar>
+            <w:shd w:fill="F8F9F9"/>
           </w:tcPr>
           <w:p>
             <w:pPr>
-              <w:spacing w:after="20" w:before="20"/>
+              <w:spacing w:after="0" w:line="262" w:lineRule="auto"/>
             </w:pPr>
             <w:r>
               <w:rPr>
@@ -525,13 +780,13 @@
                 <w:b w:val="0"/>
                 <w:sz w:val="16"/>
               </w:rPr>
-              <w:t>Una señal en el parlante, en el momento previsto; silencio y desconexión</w:t>
+              <w:t>Momento del aviso, salida de audio, silencio y desconexión</w:t>
             </w:r>
           </w:p>
         </w:tc>
         <w:tc>
           <w:tcPr>
-            <w:tcW w:type="dxa" w:w="4752"/>
+            <w:tcW w:type="dxa" w:w="3969"/>
             <w:vAlign w:val="center"/>
             <w:tcBorders>
               <w:top w:val="single" w:sz="4" w:color="D9D9D9"/>
@@ -541,11 +796,17 @@
               <w:insideH w:val="single" w:sz="4" w:color="D9D9D9"/>
               <w:insideV w:val="single" w:sz="4" w:color="D9D9D9"/>
             </w:tcBorders>
-            <w:shd w:fill="F8F9F8"/>
+            <w:tcMar>
+              <w:top w:w="75" w:type="dxa"/>
+              <w:bottom w:w="75" w:type="dxa"/>
+              <w:left w:w="90" w:type="dxa"/>
+              <w:right w:w="90" w:type="dxa"/>
+            </w:tcMar>
+            <w:shd w:fill="F8F9F9"/>
           </w:tcPr>
           <w:p>
             <w:pPr>
-              <w:spacing w:after="20" w:before="20"/>
+              <w:spacing w:after="0" w:line="262" w:lineRule="auto"/>
             </w:pPr>
             <w:r>
               <w:rPr>
@@ -553,7 +814,7 @@
                 <w:b w:val="0"/>
                 <w:sz w:val="16"/>
               </w:rPr>
-              <w:t>Fiabilidad, separada de la comprensión</w:t>
+              <w:t>Si el sistema se comporta como fue acordado</w:t>
             </w:r>
           </w:p>
         </w:tc>
@@ -561,7 +822,7 @@
       <w:tr>
         <w:tc>
           <w:tcPr>
-            <w:tcW w:type="dxa" w:w="2045"/>
+            <w:tcW w:type="dxa" w:w="2041"/>
             <w:vAlign w:val="center"/>
             <w:tcBorders>
               <w:top w:val="single" w:sz="4" w:color="D9D9D9"/>
@@ -571,10 +832,16 @@
               <w:insideH w:val="single" w:sz="4" w:color="D9D9D9"/>
               <w:insideV w:val="single" w:sz="4" w:color="D9D9D9"/>
             </w:tcBorders>
+            <w:tcMar>
+              <w:top w:w="75" w:type="dxa"/>
+              <w:bottom w:w="75" w:type="dxa"/>
+              <w:left w:w="90" w:type="dxa"/>
+              <w:right w:w="90" w:type="dxa"/>
+            </w:tcMar>
           </w:tcPr>
           <w:p>
             <w:pPr>
-              <w:spacing w:after="20" w:before="20"/>
+              <w:spacing w:after="0" w:line="262" w:lineRule="auto"/>
             </w:pPr>
             <w:r>
               <w:rPr>
@@ -582,13 +849,13 @@
                 <w:b w:val="0"/>
                 <w:sz w:val="16"/>
               </w:rPr>
-              <w:t>Recuperación</w:t>
+              <w:t>Recuperación de la intención</w:t>
             </w:r>
           </w:p>
         </w:tc>
         <w:tc>
           <w:tcPr>
-            <w:tcW w:type="dxa" w:w="3240"/>
+            <w:tcW w:type="dxa" w:w="3628"/>
             <w:vAlign w:val="center"/>
             <w:tcBorders>
               <w:top w:val="single" w:sz="4" w:color="D9D9D9"/>
@@ -598,10 +865,16 @@
               <w:insideH w:val="single" w:sz="4" w:color="D9D9D9"/>
               <w:insideV w:val="single" w:sz="4" w:color="D9D9D9"/>
             </w:tcBorders>
+            <w:tcMar>
+              <w:top w:w="75" w:type="dxa"/>
+              <w:bottom w:w="75" w:type="dxa"/>
+              <w:left w:w="90" w:type="dxa"/>
+              <w:right w:w="90" w:type="dxa"/>
+            </w:tcMar>
           </w:tcPr>
           <w:p>
             <w:pPr>
-              <w:spacing w:after="20" w:before="20"/>
+              <w:spacing w:after="0" w:line="262" w:lineRule="auto"/>
             </w:pPr>
             <w:r>
               <w:rPr>
@@ -609,13 +882,13 @@
                 <w:b w:val="0"/>
                 <w:sz w:val="16"/>
               </w:rPr>
-              <w:t>Recuerda actividad y modo de comenzar sin abrir Relevo ni recibir pistas</w:t>
+              <w:t>Recuerda actividad y forma de empezar sin pistas</w:t>
             </w:r>
           </w:p>
         </w:tc>
         <w:tc>
           <w:tcPr>
-            <w:tcW w:type="dxa" w:w="4752"/>
+            <w:tcW w:type="dxa" w:w="3969"/>
             <w:vAlign w:val="center"/>
             <w:tcBorders>
               <w:top w:val="single" w:sz="4" w:color="D9D9D9"/>
@@ -625,10 +898,16 @@
               <w:insideH w:val="single" w:sz="4" w:color="D9D9D9"/>
               <w:insideV w:val="single" w:sz="4" w:color="D9D9D9"/>
             </w:tcBorders>
+            <w:tcMar>
+              <w:top w:w="75" w:type="dxa"/>
+              <w:bottom w:w="75" w:type="dxa"/>
+              <w:left w:w="90" w:type="dxa"/>
+              <w:right w:w="90" w:type="dxa"/>
+            </w:tcMar>
           </w:tcPr>
           <w:p>
             <w:pPr>
-              <w:spacing w:after="20" w:before="20"/>
+              <w:spacing w:after="0" w:line="262" w:lineRule="auto"/>
             </w:pPr>
             <w:r>
               <w:rPr>
@@ -636,7 +915,7 @@
                 <w:b w:val="0"/>
                 <w:sz w:val="16"/>
               </w:rPr>
-              <w:t>Asociación entre señal e intención</w:t>
+              <w:t>Si el aviso se asocia con su intención inicial</w:t>
             </w:r>
           </w:p>
         </w:tc>
@@ -644,7 +923,7 @@
       <w:tr>
         <w:tc>
           <w:tcPr>
-            <w:tcW w:type="dxa" w:w="2045"/>
+            <w:tcW w:type="dxa" w:w="2041"/>
             <w:vAlign w:val="center"/>
             <w:tcBorders>
               <w:top w:val="single" w:sz="4" w:color="D9D9D9"/>
@@ -654,11 +933,17 @@
               <w:insideH w:val="single" w:sz="4" w:color="D9D9D9"/>
               <w:insideV w:val="single" w:sz="4" w:color="D9D9D9"/>
             </w:tcBorders>
-            <w:shd w:fill="F8F9F8"/>
+            <w:tcMar>
+              <w:top w:w="75" w:type="dxa"/>
+              <w:bottom w:w="75" w:type="dxa"/>
+              <w:left w:w="90" w:type="dxa"/>
+              <w:right w:w="90" w:type="dxa"/>
+            </w:tcMar>
+            <w:shd w:fill="F8F9F9"/>
           </w:tcPr>
           <w:p>
             <w:pPr>
-              <w:spacing w:after="20" w:before="20"/>
+              <w:spacing w:after="0" w:line="262" w:lineRule="auto"/>
             </w:pPr>
             <w:r>
               <w:rPr>
@@ -672,7 +957,7 @@
         </w:tc>
         <w:tc>
           <w:tcPr>
-            <w:tcW w:type="dxa" w:w="3240"/>
+            <w:tcW w:type="dxa" w:w="3628"/>
             <w:vAlign w:val="center"/>
             <w:tcBorders>
               <w:top w:val="single" w:sz="4" w:color="D9D9D9"/>
@@ -682,11 +967,17 @@
               <w:insideH w:val="single" w:sz="4" w:color="D9D9D9"/>
               <w:insideV w:val="single" w:sz="4" w:color="D9D9D9"/>
             </w:tcBorders>
-            <w:shd w:fill="F8F9F8"/>
+            <w:tcMar>
+              <w:top w:w="75" w:type="dxa"/>
+              <w:bottom w:w="75" w:type="dxa"/>
+              <w:left w:w="90" w:type="dxa"/>
+              <w:right w:w="90" w:type="dxa"/>
+            </w:tcMar>
+            <w:shd w:fill="F8F9F9"/>
           </w:tcPr>
           <w:p>
             <w:pPr>
-              <w:spacing w:after="20" w:before="20"/>
+              <w:spacing w:after="0" w:line="262" w:lineRule="auto"/>
             </w:pPr>
             <w:r>
               <w:rPr>
@@ -694,13 +985,13 @@
                 <w:b w:val="0"/>
                 <w:sz w:val="16"/>
               </w:rPr>
-              <w:t>Puede silenciar, aplazar, cambiar de idea u omitir respuesta</w:t>
+              <w:t>Puede silenciar, cambiar de idea u omitir la respuesta</w:t>
             </w:r>
           </w:p>
         </w:tc>
         <w:tc>
           <w:tcPr>
-            <w:tcW w:type="dxa" w:w="4752"/>
+            <w:tcW w:type="dxa" w:w="3969"/>
             <w:vAlign w:val="center"/>
             <w:tcBorders>
               <w:top w:val="single" w:sz="4" w:color="D9D9D9"/>
@@ -710,11 +1001,17 @@
               <w:insideH w:val="single" w:sz="4" w:color="D9D9D9"/>
               <w:insideV w:val="single" w:sz="4" w:color="D9D9D9"/>
             </w:tcBorders>
-            <w:shd w:fill="F8F9F8"/>
+            <w:tcMar>
+              <w:top w:w="75" w:type="dxa"/>
+              <w:bottom w:w="75" w:type="dxa"/>
+              <w:left w:w="90" w:type="dxa"/>
+              <w:right w:w="90" w:type="dxa"/>
+            </w:tcMar>
+            <w:shd w:fill="F8F9F9"/>
           </w:tcPr>
           <w:p>
             <w:pPr>
-              <w:spacing w:after="20" w:before="20"/>
+              <w:spacing w:after="0" w:line="262" w:lineRule="auto"/>
             </w:pPr>
             <w:r>
               <w:rPr>
@@ -722,7 +1019,7 @@
                 <w:b w:val="0"/>
                 <w:sz w:val="16"/>
               </w:rPr>
-              <w:t>Autonomía y cierre</w:t>
+              <w:t>Si conserva una salida clara en cada momento</w:t>
             </w:r>
           </w:p>
         </w:tc>
@@ -730,7 +1027,7 @@
       <w:tr>
         <w:tc>
           <w:tcPr>
-            <w:tcW w:type="dxa" w:w="2045"/>
+            <w:tcW w:type="dxa" w:w="2041"/>
             <w:vAlign w:val="center"/>
             <w:tcBorders>
               <w:top w:val="single" w:sz="4" w:color="D9D9D9"/>
@@ -740,10 +1037,16 @@
               <w:insideH w:val="single" w:sz="4" w:color="D9D9D9"/>
               <w:insideV w:val="single" w:sz="4" w:color="D9D9D9"/>
             </w:tcBorders>
+            <w:tcMar>
+              <w:top w:w="75" w:type="dxa"/>
+              <w:bottom w:w="75" w:type="dxa"/>
+              <w:left w:w="90" w:type="dxa"/>
+              <w:right w:w="90" w:type="dxa"/>
+            </w:tcMar>
           </w:tcPr>
           <w:p>
             <w:pPr>
-              <w:spacing w:after="20" w:before="20"/>
+              <w:spacing w:after="0" w:line="262" w:lineRule="auto"/>
             </w:pPr>
             <w:r>
               <w:rPr>
@@ -751,13 +1054,13 @@
                 <w:b w:val="0"/>
                 <w:sz w:val="16"/>
               </w:rPr>
-              <w:t>Carga e intrusión</w:t>
+              <w:t>Comodidad</w:t>
             </w:r>
           </w:p>
         </w:tc>
         <w:tc>
           <w:tcPr>
-            <w:tcW w:type="dxa" w:w="3240"/>
+            <w:tcW w:type="dxa" w:w="3628"/>
             <w:vAlign w:val="center"/>
             <w:tcBorders>
               <w:top w:val="single" w:sz="4" w:color="D9D9D9"/>
@@ -767,10 +1070,16 @@
               <w:insideH w:val="single" w:sz="4" w:color="D9D9D9"/>
               <w:insideV w:val="single" w:sz="4" w:color="D9D9D9"/>
             </w:tcBorders>
+            <w:tcMar>
+              <w:top w:w="75" w:type="dxa"/>
+              <w:bottom w:w="75" w:type="dxa"/>
+              <w:left w:w="90" w:type="dxa"/>
+              <w:right w:w="90" w:type="dxa"/>
+            </w:tcMar>
           </w:tcPr>
           <w:p>
             <w:pPr>
-              <w:spacing w:after="20" w:before="20"/>
+              <w:spacing w:after="0" w:line="262" w:lineRule="auto"/>
             </w:pPr>
             <w:r>
               <w:rPr>
@@ -778,13 +1087,13 @@
                 <w:b w:val="0"/>
                 <w:sz w:val="16"/>
               </w:rPr>
-              <w:t>Valoración de 1 a 7 con motivo concreto</w:t>
+              <w:t>Valoración de 1 a 7 y explicación concreta</w:t>
             </w:r>
           </w:p>
         </w:tc>
         <w:tc>
           <w:tcPr>
-            <w:tcW w:type="dxa" w:w="4752"/>
+            <w:tcW w:type="dxa" w:w="3969"/>
             <w:vAlign w:val="center"/>
             <w:tcBorders>
               <w:top w:val="single" w:sz="4" w:color="D9D9D9"/>
@@ -794,10 +1103,16 @@
               <w:insideH w:val="single" w:sz="4" w:color="D9D9D9"/>
               <w:insideV w:val="single" w:sz="4" w:color="D9D9D9"/>
             </w:tcBorders>
+            <w:tcMar>
+              <w:top w:w="75" w:type="dxa"/>
+              <w:bottom w:w="75" w:type="dxa"/>
+              <w:left w:w="90" w:type="dxa"/>
+              <w:right w:w="90" w:type="dxa"/>
+            </w:tcMar>
           </w:tcPr>
           <w:p>
             <w:pPr>
-              <w:spacing w:after="20" w:before="20"/>
+              <w:spacing w:after="0" w:line="262" w:lineRule="auto"/>
             </w:pPr>
             <w:r>
               <w:rPr>
@@ -805,7 +1120,7 @@
                 <w:b w:val="0"/>
                 <w:sz w:val="16"/>
               </w:rPr>
-              <w:t>Qué ajustar antes de repetir</w:t>
+              <w:t>Si el sonido o la frecuencia requieren ajuste</w:t>
             </w:r>
           </w:p>
         </w:tc>
@@ -813,75 +1128,111 @@
     </w:tbl>
     <w:p>
       <w:pPr>
-        <w:spacing w:after="20"/>
-      </w:pPr>
-    </w:p>
-    <w:p>
+        <w:spacing w:after="60"/>
+      </w:pPr>
       <w:r>
-        <w:t>Registrar por separado hechos observados, palabras de la persona, eventos de la app e interpretación. Una señal registrada no prueba que se percibió. La opción «Comencé» es una declaración. Si dos personas encuentran la misma dificultad, revisar ese punto; si aparece exposición de datos, imposibilidad de detener el sonido o emisión fuera de lo acordado, detener esa configuración. Estas reglas son provisionales para discusión docente, no una estimación estadística.</w:t>
+        <w:t>Separar hechos observados, palabras de la persona, registros de la app e interpretación. Un aviso registrado no prueba que fue percibido; «comencé» es una respuesta autodeclarada. Si aparece exposición de datos, imposibilidad de detener el sonido o una emisión fuera de lo acordado, suspender esa configuración. Los indicadores y reglas de ajuste son provisionales hasta la revisión docente; no constituyen resultados estadísticos.</w:t>
       </w:r>
     </w:p>
     <w:p>
       <w:pPr>
         <w:pStyle w:val="Heading1"/>
+        <w:keepLines w:val="0"/>
       </w:pPr>
       <w:r>
-        <w:t>Pendientes antes de entregar el kit</w:t>
+        <w:t>Pendientes antes de probar con personas</w:t>
       </w:r>
     </w:p>
     <w:p>
       <w:pPr>
-        <w:ind w:left="317"/>
+        <w:spacing w:after="80"/>
+        <w:ind w:left="312" w:hanging="283"/>
       </w:pPr>
       <w:r>
-        <w:t>1. Escribir un correo o teléfono de contacto real en el consentimiento y en ambas hojas.</w:t>
+        <w:rPr>
+          <w:b/>
+        </w:rPr>
+        <w:t xml:space="preserve">1. </w:t>
+      </w:r>
+      <w:r>
+        <w:t>Escribir un correo o teléfono de contacto real en el consentimiento y en ambas hojas.</w:t>
       </w:r>
     </w:p>
     <w:p>
       <w:pPr>
-        <w:ind w:left="317"/>
+        <w:spacing w:after="80"/>
+        <w:ind w:left="312" w:hanging="283"/>
       </w:pPr>
       <w:r>
-        <w:t>2. Revisar con el docente el consentimiento y los indicadores. La aceptación actual dentro de la app no explica plazo ni retiro de datos; ambos textos deben concordar.</w:t>
+        <w:rPr>
+          <w:b/>
+        </w:rPr>
+        <w:t xml:space="preserve">2. </w:t>
+      </w:r>
+      <w:r>
+        <w:t>Acordar con el docente la versión del consentimiento y los indicadores. El texto de aceptación dentro de la app debe explicar también plazo y retiro de datos.</w:t>
       </w:r>
     </w:p>
     <w:p>
       <w:pPr>
-        <w:ind w:left="317"/>
+        <w:spacing w:after="80"/>
+        <w:ind w:left="312" w:hanging="283"/>
       </w:pPr>
       <w:r>
-        <w:t>3. Establecer un código visible que vincule la hoja con los registros de la app y probar la eliminación de esos registros, incluidos los remotos. El código aleatorio de la app no aparece hoy en la hoja por sí solo.</w:t>
+        <w:rPr>
+          <w:b/>
+        </w:rPr>
+        <w:t xml:space="preserve">3. </w:t>
+      </w:r>
+      <w:r>
+        <w:t>Mostrar a cada persona un código que vincule su hoja con los registros de la app. Probar que pueden localizarse y eliminarse los datos locales y remotos si solicita retirarse.</w:t>
       </w:r>
     </w:p>
     <w:p>
       <w:pPr>
-        <w:ind w:left="317"/>
+        <w:spacing w:after="80"/>
+        <w:ind w:left="312" w:hanging="283"/>
       </w:pPr>
       <w:r>
-        <w:t>4. Verificar en un equipo físico el audio, permisos, segundo plano, desconexión y silencio con el parlante específico. Registrar el ensayo.</w:t>
+        <w:rPr>
+          <w:b/>
+        </w:rPr>
+        <w:t xml:space="preserve">4. </w:t>
+      </w:r>
+      <w:r>
+        <w:t>Registrar la prueba física de audio, segundo plano, permisos, desconexión y silencio con el teléfono y parlante específicos.</w:t>
       </w:r>
     </w:p>
     <w:p>
       <w:pPr>
-        <w:ind w:left="317"/>
+        <w:spacing w:after="80"/>
+        <w:ind w:left="312" w:hanging="283"/>
       </w:pPr>
       <w:r>
-        <w:t>5. Completar el documento individual de planificación con fechas, responsables y decisiones tras la corrección.</w:t>
+        <w:rPr>
+          <w:b/>
+        </w:rPr>
+        <w:t xml:space="preserve">5. </w:t>
+      </w:r>
+      <w:r>
+        <w:t>Tras la corrección, actualizar el plan individual y las decisiones sobre el protocolo.</w:t>
       </w:r>
     </w:p>
     <w:p>
       <w:pPr>
         <w:pStyle w:val="Heading1"/>
+        <w:keepLines w:val="0"/>
       </w:pPr>
       <w:r>
-        <w:t>Referencias</w:t>
+        <w:t>Referencias de la pauta</w:t>
       </w:r>
     </w:p>
     <w:p>
+      <w:pPr>
+        <w:spacing w:after="60"/>
+        <w:ind w:left="255" w:hanging="255"/>
+      </w:pPr>
       <w:r>
-        <w:rPr>
-          <w:i w:val="0"/>
-        </w:rPr>
         <w:t xml:space="preserve">Nielsen Norman Group. (2019). </w:t>
       </w:r>
       <w:r>
@@ -891,17 +1242,15 @@
         <w:t>Usability (user) testing 101</w:t>
       </w:r>
       <w:r>
-        <w:rPr>
-          <w:i w:val="0"/>
-        </w:rPr>
         <w:t>. https://www.nngroup.com/articles/usability-testing-101/</w:t>
       </w:r>
     </w:p>
     <w:p>
+      <w:pPr>
+        <w:spacing w:after="60"/>
+        <w:ind w:left="255" w:hanging="255"/>
+      </w:pPr>
       <w:r>
-        <w:rPr>
-          <w:i w:val="0"/>
-        </w:rPr>
         <w:t xml:space="preserve">Organización Internacional de Normalización. (2019). </w:t>
       </w:r>
       <w:r>
@@ -911,48 +1260,7 @@
         <w:t>ISO 9241-210:2019. Ergonomics of human-system interaction—Part 210: Human-centred design for interactive systems</w:t>
       </w:r>
       <w:r>
-        <w:rPr>
-          <w:i w:val="0"/>
-        </w:rPr>
         <w:t>. https://www.iso.org/standard/77520.html</w:t>
-      </w:r>
-    </w:p>
-    <w:p>
-      <w:pPr>
-        <w:pStyle w:val="Heading2"/>
-      </w:pPr>
-      <w:r>
-        <w:t>Registro de cambios</w:t>
-      </w:r>
-    </w:p>
-    <w:p>
-      <w:pPr>
-        <w:pStyle w:val="ListBullet"/>
-        <w:spacing w:after="60"/>
-        <w:ind w:left="317" w:hanging="173"/>
-      </w:pPr>
-      <w:r>
-        <w:t>Qué se creó: paquete inicial para el APK Android 2.2, el parlante Bluetooth y una hoja de evaluación de dos días que se imprime dos veces.</w:t>
-      </w:r>
-    </w:p>
-    <w:p>
-      <w:pPr>
-        <w:pStyle w:val="ListBullet"/>
-        <w:spacing w:after="60"/>
-        <w:ind w:left="317" w:hanging="173"/>
-      </w:pPr>
-      <w:r>
-        <w:t>Qué había antes: una pauta de sesión individual de 35 a 45 minutos y un consentimiento de otro montaje de luz y sonido; ninguno describía la entrega domiciliaria de este kit.</w:t>
-      </w:r>
-    </w:p>
-    <w:p>
-      <w:pPr>
-        <w:pStyle w:val="ListBullet"/>
-        <w:spacing w:after="60"/>
-        <w:ind w:left="317" w:hanging="173"/>
-      </w:pPr>
-      <w:r>
-        <w:t>Por qué: mantener correspondencia entre el material entregado, los datos recopilados, los indicadores y lo que la persona acepta. No se incorporan resultados de usuarios.</w:t>
       </w:r>
     </w:p>
     <w:p>
@@ -963,57 +1271,156 @@
     <w:p>
       <w:pPr>
         <w:pStyle w:val="Title"/>
+        <w:keepLines w:val="0"/>
       </w:pPr>
       <w:r>
-        <w:t>Consentimiento informado para el prototipo</w:t>
+        <w:t>Consentimiento informado</w:t>
+      </w:r>
+    </w:p>
+    <w:p>
+      <w:pPr>
+        <w:keepLines w:val="0"/>
+        <w:spacing w:after="200"/>
+      </w:pPr>
+      <w:r>
+        <w:t>Prueba del prototipo de Relevo  ·  dos días de participación voluntaria</w:t>
+      </w:r>
+    </w:p>
+    <w:p>
+      <w:pPr>
+        <w:spacing w:after="60"/>
+      </w:pPr>
+      <w:r>
+        <w:rPr>
+          <w:b/>
+        </w:rPr>
+        <w:t>Proyecto:</w:t>
+      </w:r>
+      <w:r>
+        <w:t xml:space="preserve"> Relevo, Proyecto de Título en Diseño, Universidad Diego Portales.</w:t>
+      </w:r>
+    </w:p>
+    <w:p>
+      <w:pPr>
+        <w:spacing w:after="60"/>
+      </w:pPr>
+      <w:r>
+        <w:rPr>
+          <w:b/>
+        </w:rPr>
+        <w:t>Responsable:</w:t>
+      </w:r>
+      <w:r>
+        <w:t xml:space="preserve"> Johan Yantén.</w:t>
+      </w:r>
+    </w:p>
+    <w:p>
+      <w:pPr>
+        <w:spacing w:after="60"/>
+      </w:pPr>
+      <w:r>
+        <w:rPr>
+          <w:b/>
+        </w:rPr>
+        <w:t>Contacto para preguntas o retiro:</w:t>
+      </w:r>
+      <w:r>
+        <w:t xml:space="preserve"> ______________________________</w:t>
+      </w:r>
+    </w:p>
+    <w:p>
+      <w:pPr>
+        <w:pStyle w:val="Heading1"/>
+        <w:keepLines w:val="0"/>
+      </w:pPr>
+      <w:r>
+        <w:t>En qué consiste la participación</w:t>
       </w:r>
     </w:p>
     <w:p>
       <w:r>
-        <w:t>Proyecto: Relevo, Proyecto de Título en Diseño, Universidad Diego Portales. Responsable: Johan Yantén. Contacto para consultas y retiro: ______________________________.</w:t>
+        <w:t>Se invita a probar durante dos días una aplicación Android y un parlante Bluetooth. En la aplicación, la persona elige una actividad que quisiera empezar, una aplicación cuyo tiempo de uso desea observar y un tiempo límite. Puede dejar el parlante cerca de lo que necesite para comenzar. Al cumplirse el tiempo, Relevo intenta emitir un aviso sonoro. Al finalizar, se le pedirá devolver el parlante y la hoja de registro utilizada. Habrá una conversación breve sobre la experiencia.</w:t>
+      </w:r>
+    </w:p>
+    <w:p>
+      <w:pPr>
+        <w:pStyle w:val="Heading1"/>
+        <w:keepLines w:val="0"/>
+      </w:pPr>
+      <w:r>
+        <w:t>Decisión voluntaria y posibles molestias</w:t>
       </w:r>
     </w:p>
     <w:p>
       <w:r>
-        <w:t>Se invita a la persona a probar durante dos días una aplicación Android y un parlante Bluetooth que emite un aviso sonoro en el lugar que ella elija. La finalidad es revisar la comprensión, la facilidad de uso y el comportamiento del prototipo. No se evalúa la memoria, disciplina ni productividad de quien participa. No hay una forma correcta de responder al aviso.</w:t>
+        <w:t>Participar es voluntario. La persona puede omitir preguntas, silenciar el parlante, dejar de usar Relevo o retirarse sin explicar el motivo ni sufrir consecuencias. Puede elegir una actividad no sensible. El sonido puede resultar molesto o llegar en un momento inoportuno; puede regular el volumen o detener la prueba. No se solicitan claves del teléfono ni información de salud. Si no tiene Android, necesitará un equipo compatible facilitado para la prueba.</w:t>
+      </w:r>
+    </w:p>
+    <w:p>
+      <w:pPr>
+        <w:pStyle w:val="Heading1"/>
+        <w:keepLines w:val="0"/>
+      </w:pPr>
+      <w:r>
+        <w:t>Información que se registra</w:t>
       </w:r>
     </w:p>
     <w:p>
       <w:r>
-        <w:t>La participación es voluntaria. Se puede omitir cualquier pregunta, detener el sonido, dejar de usar Relevo o retirarse sin dar una razón ni sufrir consecuencias. El investigador entregará un parlante Bluetooth y el APK de Relevo. La persona recibirá dos copias de la misma hoja de evaluación, una de repuesto. Se le pedirá devolver el parlante y la hoja utilizada al concluir. Duración estimada: dos días de uso voluntario y una conversación breve al final.</w:t>
+        <w:t>Relevo solicita acceso al tiempo de uso de aplicaciones y permiso de notificaciones. Si se aceptan, guarda un código aleatorio, la actividad y la forma de empezarla, el lugar declarado, la aplicación elegida, el tiempo límite y el uso acumulado de esa aplicación, además de las horas de activación, aviso y cierre. La respuesta final se guarda solo si se contesta. Los datos se conservan primero en el teléfono y se envían a una base remota cuando hay conexión. No se registran mensajes, búsquedas, imágenes ni contenido de pantalla. La hoja de respuestas se guarda separada de este consentimiento firmado.</w:t>
       </w:r>
     </w:p>
     <w:p>
       <w:r>
-        <w:t>Para funcionar, Relevo solicita a Android acceso al tiempo de uso de las aplicaciones y permiso de notificaciones. Al aceptar dentro de la app, esta guarda un código aleatorio, la actividad y el modo de empezarla, el lugar declarado, la aplicación elegida, el umbral y tiempo de uso acumulado de esa aplicación, y las horas de activación, aviso y cierre. También guarda la respuesta final si se contesta. Estos registros se conservan primero en el teléfono y se envían a una base remota protegida cuando hay conexión. No se registran mensajes, búsquedas, imágenes ni contenido de pantalla. Las respuestas escritas en la hoja serán conservadas por separado del consentimiento firmado.</w:t>
+        <w:t xml:space="preserve">Los resultados podrán aparecer de forma codificada en la memoria y en la corrección académica. No se publicarán nombres ni consentimientos firmados. Las notas y registros se eliminarán a más tardar el </w:t>
+      </w:r>
+      <w:r>
+        <w:rPr>
+          <w:b/>
+        </w:rPr>
+        <w:t>13 de enero de 2027</w:t>
+      </w:r>
+      <w:r>
+        <w:t>. Hasta entonces, la persona podrá pedir su eliminación usando el código entregado y el contacto indicado arriba. Una síntesis ya publicada sin datos que permitan reconocer a una persona no podrá separarse después. Este procedimiento requiere que antes de la prueba se compruebe la eliminación de los registros remotos.</w:t>
       </w:r>
     </w:p>
     <w:p>
+      <w:pPr>
+        <w:spacing w:after="260"/>
+      </w:pPr>
       <w:r>
-        <w:t>Es posible sentir molestia por el sonido, recibir un aviso inoportuno o preferir no describir una intención personal. La persona puede elegir una actividad no sensible, regular el volumen, silenciar o detener el ensayo. La prueba no requiere informar asuntos de salud ni entregar claves del teléfono. Una persona que no tenga Android solo podrá participar si dispone de un Android compatible facilitado para la prueba.</w:t>
+        <w:rPr>
+          <w:b/>
+        </w:rPr>
+        <w:t>Declaración:</w:t>
+      </w:r>
+      <w:r>
+        <w:t xml:space="preserve"> Leí o escuché esta información, pude hacer preguntas y acepto participar durante dos días. Entiendo que firmar esta hoja no sustituye los permisos que solicita Android ni la aceptación que muestra la aplicación.</w:t>
       </w:r>
     </w:p>
     <w:p>
+      <w:pPr>
+        <w:keepLines w:val="0"/>
+        <w:spacing w:after="320"/>
+      </w:pPr>
       <w:r>
-        <w:t>Los resultados se presentarán de forma codificada en la memoria y la corrección académica. No se publicarán nombres ni hojas firmadas. Las notas y registros codificados se eliminarán a más tardar el 13 de enero de 2027; antes de reclutar debe confirmarse que el investigador puede localizar y eliminar también el registro remoto asociado a cada persona. Mientras los datos existan, la persona puede solicitar retiro mediante el código que se le entregue. Las síntesis ya publicadas sin posibilidad de identificar a alguien no podrán separarse después.</w:t>
+        <w:t>Código entregado: ____________________    Fecha: ____________________</w:t>
       </w:r>
     </w:p>
     <w:p>
-      <w:r>
-        <w:t>Declaración: Leí o escuché esta información, pude hacer preguntas y acepto voluntariamente participar durante dos días. Sé que aceptar este papel no reemplaza los permisos de Android ni la aceptación que muestra la app.</w:t>
-      </w:r>
-    </w:p>
-    <w:p>
-      <w:r>
-        <w:t>Código entregado a la persona: __________  Fecha: __________</w:t>
-      </w:r>
-    </w:p>
-    <w:p>
+      <w:pPr>
+        <w:keepLines w:val="0"/>
+        <w:spacing w:after="320"/>
+      </w:pPr>
       <w:r>
         <w:t>Nombre y firma de quien participa: __________________________________________</w:t>
       </w:r>
     </w:p>
     <w:p>
+      <w:pPr>
+        <w:keepLines w:val="0"/>
+        <w:spacing w:after="40"/>
+      </w:pPr>
       <w:r>
         <w:t>Firma del responsable: _____________________________________________________</w:t>
       </w:r>
@@ -1026,134 +1433,387 @@
     <w:p>
       <w:pPr>
         <w:pStyle w:val="Title"/>
+        <w:keepLines w:val="0"/>
       </w:pPr>
       <w:r>
-        <w:t>Hoja de evaluación de Relevo</w:t>
+        <w:t>Registro de uso de Relevo</w:t>
       </w:r>
     </w:p>
     <w:p>
+      <w:pPr>
+        <w:keepLines w:val="0"/>
+        <w:spacing w:after="180"/>
+      </w:pPr>
       <w:r>
-        <w:t>Relevo · uso de dos días    Código: __________    Fechas: __________ y __________</w:t>
+        <w:t>Código: ________________    Día 1: ________________    Día 2: ________________</w:t>
       </w:r>
     </w:p>
     <w:p>
+      <w:pPr>
+        <w:pStyle w:val="Heading1"/>
+        <w:keepLines w:val="0"/>
+      </w:pPr>
       <w:r>
-        <w:t>Usa Relevo solo cuando haya una actividad que realmente quieras comenzar. En la app elige esa actividad, la aplicación cuyo tiempo deseas observar y el límite de tiempo. Deja el parlante cerca de lo que necesites para empezar. Cuando suene, puedes hacer la actividad, seguir en el teléfono, cambiar de idea o silenciarlo. Ninguna respuesta se considera correcta o incorrecta. Si la app pide permisos, puedes preguntar antes de aceptarlos. Si el sonido molesta, detenlo y avisa al responsable.</w:t>
+        <w:t>Cómo usarlo</w:t>
       </w:r>
     </w:p>
     <w:p>
+      <w:pPr>
+        <w:keepLines w:val="0"/>
+        <w:spacing w:after="140"/>
+      </w:pPr>
       <w:r>
-        <w:t>Día 1. ¿Usaste Relevo? Sí / No. ¿Cuántos relevos preparaste? ____</w:t>
+        <w:t>Elige una actividad, la aplicación cuyo tiempo quieres observar y un límite. Deja el parlante cerca de lo que necesitas para empezar. Si suena, puedes hacer la actividad, seguir en el teléfono, cambiar de idea o silenciarlo. Si algo falla o el sonido molesta, detén la prueba y avisa al responsable.</w:t>
       </w:r>
     </w:p>
     <w:p>
+      <w:pPr>
+        <w:pStyle w:val="Heading1"/>
+        <w:keepLines w:val="0"/>
+      </w:pPr>
       <w:r>
-        <w:t>Si no lo usaste, ¿por qué? __________________________________________________</w:t>
+        <w:t>Día 1</w:t>
       </w:r>
     </w:p>
     <w:p>
+      <w:pPr>
+        <w:keepLines w:val="0"/>
+        <w:spacing w:after="80"/>
+      </w:pPr>
       <w:r>
-        <w:t>Actividad y lugar del parlante: ______________________________________________</w:t>
+        <w:t>¿Activaste Relevo?   □ Sí     □ No        ¿Cuántas veces? ______</w:t>
       </w:r>
     </w:p>
     <w:p>
+      <w:pPr>
+        <w:keepLines w:val="0"/>
+        <w:spacing w:after="20"/>
+      </w:pPr>
       <w:r>
-        <w:t>¿Sonó el parlante? Sí / No. Si sonó, ¿qué te recordó y qué hiciste? _____________</w:t>
+        <w:rPr>
+          <w:b/>
+        </w:rPr>
+        <w:t>Si no lo activaste, ¿por qué?</w:t>
       </w:r>
     </w:p>
     <w:p>
+      <w:pPr>
+        <w:spacing w:after="60" w:line="240" w:lineRule="auto"/>
+        <w:pBdr>
+          <w:bottom w:val="single" w:sz="4" w:color="BFC3C2"/>
+        </w:pBdr>
+      </w:pPr>
       <w:r>
-        <w:t>___________________________________________________________________________</w:t>
+        <w:t xml:space="preserve"> </w:t>
       </w:r>
     </w:p>
     <w:p>
+      <w:pPr>
+        <w:keepLines w:val="0"/>
+        <w:spacing w:after="20"/>
+      </w:pPr>
       <w:r>
-        <w:t>___________________________________________________________________________</w:t>
+        <w:rPr>
+          <w:b/>
+        </w:rPr>
+        <w:t>¿Qué actividad querías empezar y dónde dejaste el parlante?</w:t>
       </w:r>
     </w:p>
     <w:p>
+      <w:pPr>
+        <w:spacing w:after="60" w:line="240" w:lineRule="auto"/>
+        <w:pBdr>
+          <w:bottom w:val="single" w:sz="4" w:color="BFC3C2"/>
+        </w:pBdr>
+      </w:pPr>
       <w:r>
-        <w:t>Día 2. ¿Usaste Relevo? Sí / No. ¿Cuántos relevos preparaste? ____</w:t>
+        <w:t xml:space="preserve"> </w:t>
       </w:r>
     </w:p>
     <w:p>
+      <w:pPr>
+        <w:keepLines w:val="0"/>
+        <w:spacing w:after="80"/>
+      </w:pPr>
       <w:r>
-        <w:t>Si no lo usaste, ¿por qué? __________________________________________________</w:t>
+        <w:t>¿Sonó el aviso?   □ Sí     □ No</w:t>
       </w:r>
     </w:p>
     <w:p>
+      <w:pPr>
+        <w:keepLines w:val="0"/>
+        <w:spacing w:after="20"/>
+      </w:pPr>
       <w:r>
-        <w:t>Actividad y lugar del parlante: ______________________________________________</w:t>
+        <w:rPr>
+          <w:b/>
+        </w:rPr>
+        <w:t>¿Qué hiciste después?</w:t>
       </w:r>
     </w:p>
     <w:p>
+      <w:pPr>
+        <w:spacing w:after="60" w:line="240" w:lineRule="auto"/>
+        <w:pBdr>
+          <w:bottom w:val="single" w:sz="4" w:color="BFC3C2"/>
+        </w:pBdr>
+      </w:pPr>
       <w:r>
-        <w:t>¿Sonó el parlante? Sí / No. Si sonó, ¿qué te recordó y qué hiciste? _____________</w:t>
+        <w:t xml:space="preserve"> </w:t>
       </w:r>
     </w:p>
     <w:p>
+      <w:pPr>
+        <w:spacing w:after="60" w:line="240" w:lineRule="auto"/>
+        <w:pBdr>
+          <w:bottom w:val="single" w:sz="4" w:color="BFC3C2"/>
+        </w:pBdr>
+      </w:pPr>
       <w:r>
-        <w:t>___________________________________________________________________________</w:t>
+        <w:t xml:space="preserve"> </w:t>
       </w:r>
     </w:p>
     <w:p>
+      <w:pPr>
+        <w:pStyle w:val="Heading1"/>
+        <w:keepLines w:val="0"/>
+      </w:pPr>
       <w:r>
-        <w:t>___________________________________________________________________________</w:t>
+        <w:t>Día 2</w:t>
       </w:r>
     </w:p>
     <w:p>
+      <w:pPr>
+        <w:keepLines w:val="0"/>
+        <w:spacing w:after="80"/>
+      </w:pPr>
       <w:r>
-        <w:t>Marca un número de 1 a 7. En las dos primeras preguntas, 1 significa muy difícil y 7 muy fácil. Para el sonido, 1 significa muy incómodo y 7 muy cómodo.</w:t>
+        <w:t>¿Activaste Relevo?   □ Sí     □ No        ¿Cuántas veces? ______</w:t>
       </w:r>
     </w:p>
     <w:p>
+      <w:pPr>
+        <w:keepLines w:val="0"/>
+        <w:spacing w:after="20"/>
+      </w:pPr>
       <w:r>
-        <w:t>Preparar Relevo:   1   2   3   4   5   6   7</w:t>
+        <w:rPr>
+          <w:b/>
+        </w:rPr>
+        <w:t>Si no lo activaste, ¿por qué?</w:t>
       </w:r>
     </w:p>
     <w:p>
+      <w:pPr>
+        <w:spacing w:after="60" w:line="240" w:lineRule="auto"/>
+        <w:pBdr>
+          <w:bottom w:val="single" w:sz="4" w:color="BFC3C2"/>
+        </w:pBdr>
+      </w:pPr>
       <w:r>
-        <w:t>Entender el aviso:  1   2   3   4   5   6   7</w:t>
+        <w:t xml:space="preserve"> </w:t>
       </w:r>
     </w:p>
     <w:p>
+      <w:pPr>
+        <w:keepLines w:val="0"/>
+        <w:spacing w:after="20"/>
+      </w:pPr>
       <w:r>
-        <w:t>Comodidad del sonido:  1   2   3   4   5   6   7</w:t>
+        <w:rPr>
+          <w:b/>
+        </w:rPr>
+        <w:t>¿Qué actividad querías empezar y dónde dejaste el parlante?</w:t>
       </w:r>
     </w:p>
     <w:p>
+      <w:pPr>
+        <w:spacing w:after="60" w:line="240" w:lineRule="auto"/>
+        <w:pBdr>
+          <w:bottom w:val="single" w:sz="4" w:color="BFC3C2"/>
+        </w:pBdr>
+      </w:pPr>
       <w:r>
-        <w:t>¿Qué parte te hizo dudar o te interrumpió? ____________________________________</w:t>
+        <w:t xml:space="preserve"> </w:t>
       </w:r>
     </w:p>
     <w:p>
+      <w:pPr>
+        <w:keepLines w:val="0"/>
+        <w:spacing w:after="80"/>
+      </w:pPr>
       <w:r>
-        <w:t>___________________________________________________________________________</w:t>
+        <w:t>¿Sonó el aviso?   □ Sí     □ No</w:t>
       </w:r>
     </w:p>
     <w:p>
+      <w:pPr>
+        <w:keepLines w:val="0"/>
+        <w:spacing w:after="20"/>
+      </w:pPr>
       <w:r>
-        <w:t>___________________________________________________________________________</w:t>
+        <w:rPr>
+          <w:b/>
+        </w:rPr>
+        <w:t>¿Qué hiciste después?</w:t>
       </w:r>
     </w:p>
     <w:p>
+      <w:pPr>
+        <w:spacing w:after="60" w:line="240" w:lineRule="auto"/>
+        <w:pBdr>
+          <w:bottom w:val="single" w:sz="4" w:color="BFC3C2"/>
+        </w:pBdr>
+      </w:pPr>
       <w:r>
-        <w:t>¿Qué cambiarías antes de volver a usarlo? _____________________________________</w:t>
+        <w:t xml:space="preserve"> </w:t>
       </w:r>
     </w:p>
     <w:p>
+      <w:pPr>
+        <w:spacing w:after="60" w:line="240" w:lineRule="auto"/>
+        <w:pBdr>
+          <w:bottom w:val="single" w:sz="4" w:color="BFC3C2"/>
+        </w:pBdr>
+      </w:pPr>
       <w:r>
-        <w:t>___________________________________________________________________________</w:t>
+        <w:t xml:space="preserve"> </w:t>
       </w:r>
     </w:p>
     <w:p>
+      <w:pPr>
+        <w:pStyle w:val="Heading1"/>
+        <w:keepLines w:val="0"/>
+      </w:pPr>
       <w:r>
-        <w:t>___________________________________________________________________________</w:t>
+        <w:t>Después de los dos días</w:t>
       </w:r>
     </w:p>
     <w:p>
+      <w:pPr>
+        <w:keepLines w:val="0"/>
+        <w:spacing w:after="80"/>
+      </w:pPr>
       <w:r>
-        <w:t>Si algo falla: anota qué pasó y en qué momento. No necesitas arreglar el teléfono ni el parlante por tu cuenta. Contacto del responsable: ______________________________.</w:t>
+        <w:t>Marca una opción por línea. 1 es muy difícil o incómodo; 7 es muy fácil o cómodo.</w:t>
+      </w:r>
+    </w:p>
+    <w:p>
+      <w:pPr>
+        <w:keepLines/>
+        <w:spacing w:after="60"/>
+      </w:pPr>
+      <w:r>
+        <w:t>Preparar Relevo     □ 1   □ 2   □ 3   □ 4   □ 5   □ 6   □ 7</w:t>
+      </w:r>
+    </w:p>
+    <w:p>
+      <w:pPr>
+        <w:keepLines/>
+        <w:spacing w:after="60"/>
+      </w:pPr>
+      <w:r>
+        <w:t>Entender el aviso     □ 1   □ 2   □ 3   □ 4   □ 5   □ 6   □ 7</w:t>
+      </w:r>
+    </w:p>
+    <w:p>
+      <w:pPr>
+        <w:keepLines/>
+        <w:spacing w:after="60"/>
+      </w:pPr>
+      <w:r>
+        <w:t>Comodidad del sonido     □ 1   □ 2   □ 3   □ 4   □ 5   □ 6   □ 7</w:t>
+      </w:r>
+    </w:p>
+    <w:p>
+      <w:pPr>
+        <w:keepLines w:val="0"/>
+        <w:spacing w:after="20"/>
+      </w:pPr>
+      <w:r>
+        <w:rPr>
+          <w:b/>
+        </w:rPr>
+        <w:t>¿Qué te hizo dudar o te interrumpió?</w:t>
+      </w:r>
+    </w:p>
+    <w:p>
+      <w:pPr>
+        <w:spacing w:after="60" w:line="240" w:lineRule="auto"/>
+        <w:pBdr>
+          <w:bottom w:val="single" w:sz="4" w:color="BFC3C2"/>
+        </w:pBdr>
+      </w:pPr>
+      <w:r>
+        <w:t xml:space="preserve"> </w:t>
+      </w:r>
+    </w:p>
+    <w:p>
+      <w:pPr>
+        <w:spacing w:after="60" w:line="240" w:lineRule="auto"/>
+        <w:pBdr>
+          <w:bottom w:val="single" w:sz="4" w:color="BFC3C2"/>
+        </w:pBdr>
+      </w:pPr>
+      <w:r>
+        <w:t xml:space="preserve"> </w:t>
+      </w:r>
+    </w:p>
+    <w:p>
+      <w:pPr>
+        <w:keepLines w:val="0"/>
+        <w:spacing w:after="20"/>
+      </w:pPr>
+      <w:r>
+        <w:rPr>
+          <w:b/>
+        </w:rPr>
+        <w:t>¿Qué cambiarías antes de volver a usarlo?</w:t>
+      </w:r>
+    </w:p>
+    <w:p>
+      <w:pPr>
+        <w:spacing w:after="60" w:line="240" w:lineRule="auto"/>
+        <w:pBdr>
+          <w:bottom w:val="single" w:sz="4" w:color="BFC3C2"/>
+        </w:pBdr>
+      </w:pPr>
+      <w:r>
+        <w:t xml:space="preserve"> </w:t>
+      </w:r>
+    </w:p>
+    <w:p>
+      <w:pPr>
+        <w:spacing w:after="60" w:line="240" w:lineRule="auto"/>
+        <w:pBdr>
+          <w:bottom w:val="single" w:sz="4" w:color="BFC3C2"/>
+        </w:pBdr>
+      </w:pPr>
+      <w:r>
+        <w:t xml:space="preserve"> </w:t>
+      </w:r>
+    </w:p>
+    <w:p>
+      <w:pPr>
+        <w:spacing w:after="60"/>
+      </w:pPr>
+      <w:r>
+        <w:rPr>
+          <w:b/>
+        </w:rPr>
+        <w:t>Si algo falla:</w:t>
+      </w:r>
+      <w:r>
+        <w:t xml:space="preserve"> anota cuándo ocurrió. No tienes que reparar el equipo por tu cuenta.</w:t>
+      </w:r>
+    </w:p>
+    <w:p>
+      <w:pPr>
+        <w:keepLines w:val="0"/>
+        <w:spacing w:after="0"/>
+      </w:pPr>
+      <w:r>
+        <w:t>Contacto del responsable: _________________________________________________</w:t>
       </w:r>
     </w:p>
     <w:p>
@@ -1164,139 +1824,392 @@
     <w:p>
       <w:pPr>
         <w:pStyle w:val="Title"/>
+        <w:keepLines w:val="0"/>
       </w:pPr>
       <w:r>
-        <w:t>Hoja de evaluación de Relevo</w:t>
+        <w:t>Registro de uso de Relevo</w:t>
       </w:r>
     </w:p>
     <w:p>
+      <w:pPr>
+        <w:keepLines w:val="0"/>
+        <w:spacing w:after="180"/>
+      </w:pPr>
       <w:r>
-        <w:t>Relevo · uso de dos días    Código: __________    Fechas: __________ y __________</w:t>
+        <w:t>Código: ________________    Día 1: ________________    Día 2: ________________</w:t>
       </w:r>
     </w:p>
     <w:p>
+      <w:pPr>
+        <w:pStyle w:val="Heading1"/>
+        <w:keepLines w:val="0"/>
+      </w:pPr>
       <w:r>
-        <w:t>Usa Relevo solo cuando haya una actividad que realmente quieras comenzar. En la app elige esa actividad, la aplicación cuyo tiempo deseas observar y el límite de tiempo. Deja el parlante cerca de lo que necesites para empezar. Cuando suene, puedes hacer la actividad, seguir en el teléfono, cambiar de idea o silenciarlo. Ninguna respuesta se considera correcta o incorrecta. Si la app pide permisos, puedes preguntar antes de aceptarlos. Si el sonido molesta, detenlo y avisa al responsable.</w:t>
+        <w:t>Cómo usarlo</w:t>
       </w:r>
     </w:p>
     <w:p>
+      <w:pPr>
+        <w:keepLines w:val="0"/>
+        <w:spacing w:after="140"/>
+      </w:pPr>
       <w:r>
-        <w:t>Día 1. ¿Usaste Relevo? Sí / No. ¿Cuántos relevos preparaste? ____</w:t>
+        <w:t>Elige una actividad, la aplicación cuyo tiempo quieres observar y un límite. Deja el parlante cerca de lo que necesitas para empezar. Si suena, puedes hacer la actividad, seguir en el teléfono, cambiar de idea o silenciarlo. Si algo falla o el sonido molesta, detén la prueba y avisa al responsable.</w:t>
       </w:r>
     </w:p>
     <w:p>
+      <w:pPr>
+        <w:pStyle w:val="Heading1"/>
+        <w:keepLines w:val="0"/>
+      </w:pPr>
       <w:r>
-        <w:t>Si no lo usaste, ¿por qué? __________________________________________________</w:t>
+        <w:t>Día 1</w:t>
       </w:r>
     </w:p>
     <w:p>
+      <w:pPr>
+        <w:keepLines w:val="0"/>
+        <w:spacing w:after="80"/>
+      </w:pPr>
       <w:r>
-        <w:t>Actividad y lugar del parlante: ______________________________________________</w:t>
+        <w:t>¿Activaste Relevo?   □ Sí     □ No        ¿Cuántas veces? ______</w:t>
       </w:r>
     </w:p>
     <w:p>
+      <w:pPr>
+        <w:keepLines w:val="0"/>
+        <w:spacing w:after="20"/>
+      </w:pPr>
       <w:r>
-        <w:t>¿Sonó el parlante? Sí / No. Si sonó, ¿qué te recordó y qué hiciste? _____________</w:t>
+        <w:rPr>
+          <w:b/>
+        </w:rPr>
+        <w:t>Si no lo activaste, ¿por qué?</w:t>
       </w:r>
     </w:p>
     <w:p>
+      <w:pPr>
+        <w:spacing w:after="60" w:line="240" w:lineRule="auto"/>
+        <w:pBdr>
+          <w:bottom w:val="single" w:sz="4" w:color="BFC3C2"/>
+        </w:pBdr>
+      </w:pPr>
       <w:r>
-        <w:t>___________________________________________________________________________</w:t>
+        <w:t xml:space="preserve"> </w:t>
       </w:r>
     </w:p>
     <w:p>
+      <w:pPr>
+        <w:keepLines w:val="0"/>
+        <w:spacing w:after="20"/>
+      </w:pPr>
       <w:r>
-        <w:t>___________________________________________________________________________</w:t>
+        <w:rPr>
+          <w:b/>
+        </w:rPr>
+        <w:t>¿Qué actividad querías empezar y dónde dejaste el parlante?</w:t>
       </w:r>
     </w:p>
     <w:p>
+      <w:pPr>
+        <w:spacing w:after="60" w:line="240" w:lineRule="auto"/>
+        <w:pBdr>
+          <w:bottom w:val="single" w:sz="4" w:color="BFC3C2"/>
+        </w:pBdr>
+      </w:pPr>
       <w:r>
-        <w:t>Día 2. ¿Usaste Relevo? Sí / No. ¿Cuántos relevos preparaste? ____</w:t>
+        <w:t xml:space="preserve"> </w:t>
       </w:r>
     </w:p>
     <w:p>
+      <w:pPr>
+        <w:keepLines w:val="0"/>
+        <w:spacing w:after="80"/>
+      </w:pPr>
       <w:r>
-        <w:t>Si no lo usaste, ¿por qué? __________________________________________________</w:t>
+        <w:t>¿Sonó el aviso?   □ Sí     □ No</w:t>
       </w:r>
     </w:p>
     <w:p>
+      <w:pPr>
+        <w:keepLines w:val="0"/>
+        <w:spacing w:after="20"/>
+      </w:pPr>
       <w:r>
-        <w:t>Actividad y lugar del parlante: ______________________________________________</w:t>
+        <w:rPr>
+          <w:b/>
+        </w:rPr>
+        <w:t>¿Qué hiciste después?</w:t>
       </w:r>
     </w:p>
     <w:p>
+      <w:pPr>
+        <w:spacing w:after="60" w:line="240" w:lineRule="auto"/>
+        <w:pBdr>
+          <w:bottom w:val="single" w:sz="4" w:color="BFC3C2"/>
+        </w:pBdr>
+      </w:pPr>
       <w:r>
-        <w:t>¿Sonó el parlante? Sí / No. Si sonó, ¿qué te recordó y qué hiciste? _____________</w:t>
+        <w:t xml:space="preserve"> </w:t>
       </w:r>
     </w:p>
     <w:p>
+      <w:pPr>
+        <w:spacing w:after="60" w:line="240" w:lineRule="auto"/>
+        <w:pBdr>
+          <w:bottom w:val="single" w:sz="4" w:color="BFC3C2"/>
+        </w:pBdr>
+      </w:pPr>
       <w:r>
-        <w:t>___________________________________________________________________________</w:t>
+        <w:t xml:space="preserve"> </w:t>
       </w:r>
     </w:p>
     <w:p>
+      <w:pPr>
+        <w:pStyle w:val="Heading1"/>
+        <w:keepLines w:val="0"/>
+      </w:pPr>
       <w:r>
-        <w:t>___________________________________________________________________________</w:t>
+        <w:t>Día 2</w:t>
       </w:r>
     </w:p>
     <w:p>
+      <w:pPr>
+        <w:keepLines w:val="0"/>
+        <w:spacing w:after="80"/>
+      </w:pPr>
       <w:r>
-        <w:t>Marca un número de 1 a 7. En las dos primeras preguntas, 1 significa muy difícil y 7 muy fácil. Para el sonido, 1 significa muy incómodo y 7 muy cómodo.</w:t>
+        <w:t>¿Activaste Relevo?   □ Sí     □ No        ¿Cuántas veces? ______</w:t>
       </w:r>
     </w:p>
     <w:p>
+      <w:pPr>
+        <w:keepLines w:val="0"/>
+        <w:spacing w:after="20"/>
+      </w:pPr>
       <w:r>
-        <w:t>Preparar Relevo:   1   2   3   4   5   6   7</w:t>
+        <w:rPr>
+          <w:b/>
+        </w:rPr>
+        <w:t>Si no lo activaste, ¿por qué?</w:t>
       </w:r>
     </w:p>
     <w:p>
+      <w:pPr>
+        <w:spacing w:after="60" w:line="240" w:lineRule="auto"/>
+        <w:pBdr>
+          <w:bottom w:val="single" w:sz="4" w:color="BFC3C2"/>
+        </w:pBdr>
+      </w:pPr>
       <w:r>
-        <w:t>Entender el aviso:  1   2   3   4   5   6   7</w:t>
+        <w:t xml:space="preserve"> </w:t>
       </w:r>
     </w:p>
     <w:p>
+      <w:pPr>
+        <w:keepLines w:val="0"/>
+        <w:spacing w:after="20"/>
+      </w:pPr>
       <w:r>
-        <w:t>Comodidad del sonido:  1   2   3   4   5   6   7</w:t>
+        <w:rPr>
+          <w:b/>
+        </w:rPr>
+        <w:t>¿Qué actividad querías empezar y dónde dejaste el parlante?</w:t>
       </w:r>
     </w:p>
     <w:p>
+      <w:pPr>
+        <w:spacing w:after="60" w:line="240" w:lineRule="auto"/>
+        <w:pBdr>
+          <w:bottom w:val="single" w:sz="4" w:color="BFC3C2"/>
+        </w:pBdr>
+      </w:pPr>
       <w:r>
-        <w:t>¿Qué parte te hizo dudar o te interrumpió? ____________________________________</w:t>
+        <w:t xml:space="preserve"> </w:t>
       </w:r>
     </w:p>
     <w:p>
+      <w:pPr>
+        <w:keepLines w:val="0"/>
+        <w:spacing w:after="80"/>
+      </w:pPr>
       <w:r>
-        <w:t>___________________________________________________________________________</w:t>
+        <w:t>¿Sonó el aviso?   □ Sí     □ No</w:t>
       </w:r>
     </w:p>
     <w:p>
+      <w:pPr>
+        <w:keepLines w:val="0"/>
+        <w:spacing w:after="20"/>
+      </w:pPr>
       <w:r>
-        <w:t>___________________________________________________________________________</w:t>
+        <w:rPr>
+          <w:b/>
+        </w:rPr>
+        <w:t>¿Qué hiciste después?</w:t>
       </w:r>
     </w:p>
     <w:p>
+      <w:pPr>
+        <w:spacing w:after="60" w:line="240" w:lineRule="auto"/>
+        <w:pBdr>
+          <w:bottom w:val="single" w:sz="4" w:color="BFC3C2"/>
+        </w:pBdr>
+      </w:pPr>
       <w:r>
-        <w:t>¿Qué cambiarías antes de volver a usarlo? _____________________________________</w:t>
+        <w:t xml:space="preserve"> </w:t>
       </w:r>
     </w:p>
     <w:p>
+      <w:pPr>
+        <w:spacing w:after="60" w:line="240" w:lineRule="auto"/>
+        <w:pBdr>
+          <w:bottom w:val="single" w:sz="4" w:color="BFC3C2"/>
+        </w:pBdr>
+      </w:pPr>
       <w:r>
-        <w:t>___________________________________________________________________________</w:t>
+        <w:t xml:space="preserve"> </w:t>
       </w:r>
     </w:p>
     <w:p>
+      <w:pPr>
+        <w:pStyle w:val="Heading1"/>
+        <w:keepLines w:val="0"/>
+      </w:pPr>
       <w:r>
-        <w:t>___________________________________________________________________________</w:t>
+        <w:t>Después de los dos días</w:t>
       </w:r>
     </w:p>
     <w:p>
+      <w:pPr>
+        <w:keepLines w:val="0"/>
+        <w:spacing w:after="80"/>
+      </w:pPr>
       <w:r>
-        <w:t>Si algo falla: anota qué pasó y en qué momento. No necesitas arreglar el teléfono ni el parlante por tu cuenta. Contacto del responsable: ______________________________.</w:t>
+        <w:t>Marca una opción por línea. 1 es muy difícil o incómodo; 7 es muy fácil o cómodo.</w:t>
+      </w:r>
+    </w:p>
+    <w:p>
+      <w:pPr>
+        <w:keepLines/>
+        <w:spacing w:after="60"/>
+      </w:pPr>
+      <w:r>
+        <w:t>Preparar Relevo     □ 1   □ 2   □ 3   □ 4   □ 5   □ 6   □ 7</w:t>
+      </w:r>
+    </w:p>
+    <w:p>
+      <w:pPr>
+        <w:keepLines/>
+        <w:spacing w:after="60"/>
+      </w:pPr>
+      <w:r>
+        <w:t>Entender el aviso     □ 1   □ 2   □ 3   □ 4   □ 5   □ 6   □ 7</w:t>
+      </w:r>
+    </w:p>
+    <w:p>
+      <w:pPr>
+        <w:keepLines/>
+        <w:spacing w:after="60"/>
+      </w:pPr>
+      <w:r>
+        <w:t>Comodidad del sonido     □ 1   □ 2   □ 3   □ 4   □ 5   □ 6   □ 7</w:t>
+      </w:r>
+    </w:p>
+    <w:p>
+      <w:pPr>
+        <w:keepLines w:val="0"/>
+        <w:spacing w:after="20"/>
+      </w:pPr>
+      <w:r>
+        <w:rPr>
+          <w:b/>
+        </w:rPr>
+        <w:t>¿Qué te hizo dudar o te interrumpió?</w:t>
+      </w:r>
+    </w:p>
+    <w:p>
+      <w:pPr>
+        <w:spacing w:after="60" w:line="240" w:lineRule="auto"/>
+        <w:pBdr>
+          <w:bottom w:val="single" w:sz="4" w:color="BFC3C2"/>
+        </w:pBdr>
+      </w:pPr>
+      <w:r>
+        <w:t xml:space="preserve"> </w:t>
+      </w:r>
+    </w:p>
+    <w:p>
+      <w:pPr>
+        <w:spacing w:after="60" w:line="240" w:lineRule="auto"/>
+        <w:pBdr>
+          <w:bottom w:val="single" w:sz="4" w:color="BFC3C2"/>
+        </w:pBdr>
+      </w:pPr>
+      <w:r>
+        <w:t xml:space="preserve"> </w:t>
+      </w:r>
+    </w:p>
+    <w:p>
+      <w:pPr>
+        <w:keepLines w:val="0"/>
+        <w:spacing w:after="20"/>
+      </w:pPr>
+      <w:r>
+        <w:rPr>
+          <w:b/>
+        </w:rPr>
+        <w:t>¿Qué cambiarías antes de volver a usarlo?</w:t>
+      </w:r>
+    </w:p>
+    <w:p>
+      <w:pPr>
+        <w:spacing w:after="60" w:line="240" w:lineRule="auto"/>
+        <w:pBdr>
+          <w:bottom w:val="single" w:sz="4" w:color="BFC3C2"/>
+        </w:pBdr>
+      </w:pPr>
+      <w:r>
+        <w:t xml:space="preserve"> </w:t>
+      </w:r>
+    </w:p>
+    <w:p>
+      <w:pPr>
+        <w:spacing w:after="60" w:line="240" w:lineRule="auto"/>
+        <w:pBdr>
+          <w:bottom w:val="single" w:sz="4" w:color="BFC3C2"/>
+        </w:pBdr>
+      </w:pPr>
+      <w:r>
+        <w:t xml:space="preserve"> </w:t>
+      </w:r>
+    </w:p>
+    <w:p>
+      <w:pPr>
+        <w:spacing w:after="60"/>
+      </w:pPr>
+      <w:r>
+        <w:rPr>
+          <w:b/>
+        </w:rPr>
+        <w:t>Si algo falla:</w:t>
+      </w:r>
+      <w:r>
+        <w:t xml:space="preserve"> anota cuándo ocurrió. No tienes que reparar el equipo por tu cuenta.</w:t>
+      </w:r>
+    </w:p>
+    <w:p>
+      <w:pPr>
+        <w:keepLines w:val="0"/>
+        <w:spacing w:after="0"/>
+      </w:pPr>
+      <w:r>
+        <w:t>Contacto del responsable: _________________________________________________</w:t>
       </w:r>
     </w:p>
     <w:sectPr>
-      <w:pgSz w:w="12240" w:h="15840"/>
-      <w:pgMar w:top="835" w:right="1094" w:bottom="835" w:left="1094" w:header="403" w:footer="403" w:gutter="0"/>
+      <w:pgSz w:w="11906" w:h="16838"/>
+      <w:pgMar w:top="1020" w:right="1134" w:bottom="964" w:left="1134" w:header="720" w:footer="720" w:gutter="0"/>
       <w:cols w:space="720"/>
       <w:docGrid w:linePitch="360"/>
     </w:sectPr>
@@ -1668,12 +2581,12 @@
     <w:qFormat/>
     <w:rsid w:val="00FC693F"/>
     <w:pPr>
-      <w:spacing w:after="100" w:line="269" w:lineRule="auto"/>
+      <w:spacing w:line="278" w:lineRule="auto" w:after="100"/>
     </w:pPr>
     <w:rPr>
       <w:rFonts w:ascii="Arial" w:hAnsi="Arial"/>
       <w:color w:val="000000"/>
-      <w:sz w:val="19"/>
+      <w:sz w:val="18"/>
     </w:rPr>
   </w:style>
   <w:style w:type="paragraph" w:styleId="Header">
@@ -1731,7 +2644,7 @@
     <w:pPr>
       <w:keepNext/>
       <w:keepLines/>
-      <w:spacing w:before="220" w:after="120"/>
+      <w:spacing w:before="220" w:after="100"/>
       <w:outlineLvl w:val="0"/>
     </w:pPr>
     <w:rPr>
@@ -1739,7 +2652,7 @@
       <w:b/>
       <w:bCs/>
       <w:color w:val="000000"/>
-      <w:sz w:val="26"/>
+      <w:sz w:val="22"/>
       <w:szCs w:val="28"/>
     </w:rPr>
   </w:style>
@@ -1755,7 +2668,7 @@
     <w:pPr>
       <w:keepNext/>
       <w:keepLines/>
-      <w:spacing w:before="160" w:after="80"/>
+      <w:spacing w:before="160" w:after="60"/>
       <w:outlineLvl w:val="1"/>
     </w:pPr>
     <w:rPr>
@@ -1763,7 +2676,7 @@
       <w:b/>
       <w:bCs/>
       <w:color w:val="000000"/>
-      <w:sz w:val="21"/>
+      <w:sz w:val="20"/>
       <w:szCs w:val="26"/>
     </w:rPr>
   </w:style>
@@ -2017,7 +2930,8 @@
     <w:qFormat/>
     <w:rsid w:val="00FC693F"/>
     <w:pPr>
-      <w:spacing w:after="240" w:line="240" w:lineRule="auto"/>
+      <w:keepNext/>
+      <w:spacing w:after="160" w:line="240" w:lineRule="auto"/>
       <w:contextualSpacing/>
     </w:pPr>
     <w:rPr>
@@ -2026,7 +2940,7 @@
       <w:color w:val="000000"/>
       <w:spacing w:val="5"/>
       <w:kern w:val="28"/>
-      <w:sz w:val="40"/>
+      <w:sz w:val="36"/>
       <w:szCs w:val="52"/>
     </w:rPr>
   </w:style>

</xml_diff>